<commit_message>
To implement dynamic task management with active IT assignment and audit tracking
</commit_message>
<xml_diff>
--- a/document/closed_tt.docx
+++ b/document/closed_tt.docx
@@ -29,19 +29,15 @@
       </w:r>
     </w:p>
     <w:p/>
-    <w:p>
-      <w:r>
-        <w:t>-------------------------------------------------------------------------------------</w:t>
-      </w:r>
-    </w:p>
-    <w:p>
-      <w:r>
-        <w:t>shakil.khan</w:t>
-      </w:r>
-    </w:p>
-    <w:p>
-      <w:r>
-        <w:t>munmunj1</w:t>
+    <w:p/>
+    <w:p>
+      <w:r>
+        <w:t>Probook@2023</w:t>
+      </w:r>
+    </w:p>
+    <w:p>
+      <w:r>
+        <w:t>Rustam</w:t>
       </w:r>
     </w:p>
     <w:p>
@@ -51,15 +47,34 @@
         </w:pBdr>
       </w:pPr>
     </w:p>
-    <w:p/>
-    <w:p>
-      <w:r>
-        <w:t>nur.hosen</w:t>
-      </w:r>
-    </w:p>
-    <w:p>
-      <w:r>
-        <w:t>Nh.121212</w:t>
+    <w:p>
+      <w:r>
+        <w:t>smariful</w:t>
+      </w:r>
+    </w:p>
+    <w:p>
+      <w:r>
+        <w:t>Arif@Dipu12</w:t>
+      </w:r>
+    </w:p>
+    <w:p>
+      <w:r>
+        <w:t xml:space="preserve">'02-2248', </w:t>
+      </w:r>
+    </w:p>
+    <w:p>
+      <w:r>
+        <w:t>-------------------------------------------------------------------------------------</w:t>
+      </w:r>
+    </w:p>
+    <w:p>
+      <w:r>
+        <w:t>shakil.khan</w:t>
+      </w:r>
+    </w:p>
+    <w:p>
+      <w:r>
+        <w:t>munmunj1</w:t>
       </w:r>
     </w:p>
     <w:p>
@@ -72,6 +87,24 @@
     <w:p/>
     <w:p>
       <w:r>
+        <w:t>nur.hosen</w:t>
+      </w:r>
+    </w:p>
+    <w:p>
+      <w:r>
+        <w:t>Nh.121212</w:t>
+      </w:r>
+    </w:p>
+    <w:p>
+      <w:pPr>
+        <w:pBdr>
+          <w:bottom w:val="single" w:sz="6" w:space="1" w:color="auto"/>
+        </w:pBdr>
+      </w:pPr>
+    </w:p>
+    <w:p/>
+    <w:p>
+      <w:r>
         <w:t>limon.miah</w:t>
       </w:r>
     </w:p>
@@ -87,13 +120,7 @@
           <w:rPr>
             <w:rStyle w:val="Hyperlink"/>
           </w:rPr>
-          <w:t>https://chatgpt.com/c/6aa2469a-b218-83ee-a063-cf066ce977cc</w:t>
-        </w:r>
-        <w:r>
-          <w:rPr>
-            <w:rStyle w:val="Hyperlink"/>
-          </w:rPr>
-          <w:t>\</w:t>
+          <w:t>https://chatgpt.com/c/6aa2469a-b218-83ee-a063-cf066ce977cc\</w:t>
         </w:r>
       </w:hyperlink>
     </w:p>
@@ -135,15 +162,7 @@
           <w:iCs/>
           <w:color w:val="EE0000"/>
         </w:rPr>
-        <w:t xml:space="preserve">These two files  </w:t>
-      </w:r>
-      <w:r>
-        <w:rPr>
-          <w:i/>
-          <w:iCs/>
-          <w:color w:val="EE0000"/>
-        </w:rPr>
-        <w:t>itm/frontend/components/tt-columns.tsx</w:t>
+        <w:t>These two files  itm/frontend/components/tt-columns.tsx</w:t>
       </w:r>
     </w:p>
     <w:p>
@@ -160,36 +179,22 @@
           <w:iCs/>
           <w:color w:val="EE0000"/>
         </w:rPr>
-        <w:lastRenderedPageBreak/>
-        <w:t>frontend/components/TTTable.tsx</w:t>
-      </w:r>
+        <w:t>frontend/components/TTTable.tsx are involved in itm/backend/internal/handler/handlers.go</w:t>
+      </w:r>
+    </w:p>
+    <w:p/>
+    <w:p/>
+    <w:p>
+      <w:r>
+        <w:t>select id, employee_id, status, created_at, closed_at, closed_by, closing_description from   trouble_tickets where id ='29578'</w:t>
+      </w:r>
+    </w:p>
+    <w:p/>
+    <w:p>
       <w:r>
         <w:rPr>
-          <w:i/>
-          <w:iCs/>
-          <w:color w:val="EE0000"/>
+          <w:noProof/>
         </w:rPr>
-        <w:t xml:space="preserve"> are involved in </w:t>
-      </w:r>
-      <w:r>
-        <w:rPr>
-          <w:i/>
-          <w:iCs/>
-          <w:color w:val="EE0000"/>
-        </w:rPr>
-        <w:t>itm/backend/internal/handler/handlers.go</w:t>
-      </w:r>
-    </w:p>
-    <w:p/>
-    <w:p/>
-    <w:p>
-      <w:r>
-        <w:t>select id, employee_id, status, created_at, closed_at, closed_by, closing_description from   trouble_tickets where id ='29578'</w:t>
-      </w:r>
-    </w:p>
-    <w:p/>
-    <w:p>
-      <w:r>
         <w:drawing>
           <wp:inline distT="0" distB="0" distL="0" distR="0" wp14:anchorId="069642F1" wp14:editId="4B911087">
             <wp:extent cx="5943600" cy="3150235"/>
@@ -231,6 +236,7 @@
     <w:p/>
     <w:p>
       <w:r>
+        <w:lastRenderedPageBreak/>
         <w:t>Yes, you can run this in pgAdmin, but first confirm the actual table and column names match exactly:</w:t>
       </w:r>
     </w:p>
@@ -261,48 +267,139 @@
     <w:p/>
     <w:p>
       <w:r>
+        <w:t>INSERT INTO public.auth_permissions (</w:t>
+      </w:r>
+    </w:p>
+    <w:p>
+      <w:r>
+        <w:t xml:space="preserve">    code,</w:t>
+      </w:r>
+    </w:p>
+    <w:p>
+      <w:r>
+        <w:t xml:space="preserve">    name,</w:t>
+      </w:r>
+    </w:p>
+    <w:p>
+      <w:r>
+        <w:t xml:space="preserve">    active</w:t>
+      </w:r>
+    </w:p>
+    <w:p>
+      <w:r>
+        <w:t>)</w:t>
+      </w:r>
+    </w:p>
+    <w:p>
+      <w:r>
+        <w:t>VALUES (</w:t>
+      </w:r>
+    </w:p>
+    <w:p>
+      <w:r>
+        <w:t xml:space="preserve">    'TT_Close',</w:t>
+      </w:r>
+    </w:p>
+    <w:p>
+      <w:r>
+        <w:t xml:space="preserve">    'Close Trouble Ticket',</w:t>
+      </w:r>
+    </w:p>
+    <w:p>
+      <w:r>
+        <w:t xml:space="preserve">    TRUE</w:t>
+      </w:r>
+    </w:p>
+    <w:p>
+      <w:r>
+        <w:t>)</w:t>
+      </w:r>
+    </w:p>
+    <w:p>
+      <w:r>
+        <w:t>ON CONFLICT (code)</w:t>
+      </w:r>
+    </w:p>
+    <w:p>
+      <w:r>
+        <w:t>DO UPDATE SET</w:t>
+      </w:r>
+    </w:p>
+    <w:p>
+      <w:r>
+        <w:t xml:space="preserve">    name = EXCLUDED.name,</w:t>
+      </w:r>
+    </w:p>
+    <w:p>
+      <w:r>
+        <w:t xml:space="preserve">    active = TRUE;</w:t>
+      </w:r>
+    </w:p>
+    <w:p/>
+    <w:p>
+      <w:r>
+        <w:t>INSERT INTO public.auth_role_permissions (</w:t>
+      </w:r>
+    </w:p>
+    <w:p>
+      <w:r>
+        <w:t xml:space="preserve">    role_id,</w:t>
+      </w:r>
+    </w:p>
+    <w:p>
+      <w:r>
+        <w:t xml:space="preserve">    permission_id</w:t>
+      </w:r>
+    </w:p>
+    <w:p>
+      <w:r>
         <w:lastRenderedPageBreak/>
-        <w:t>INSERT INTO public.auth_permissions (</w:t>
-      </w:r>
-    </w:p>
-    <w:p>
-      <w:r>
-        <w:t xml:space="preserve">    code,</w:t>
-      </w:r>
-    </w:p>
-    <w:p>
-      <w:r>
-        <w:t xml:space="preserve">    name,</w:t>
-      </w:r>
-    </w:p>
-    <w:p>
-      <w:r>
-        <w:t xml:space="preserve">    active</w:t>
-      </w:r>
-    </w:p>
-    <w:p>
-      <w:r>
         <w:t>)</w:t>
       </w:r>
     </w:p>
     <w:p>
       <w:r>
-        <w:t>VALUES (</w:t>
-      </w:r>
-    </w:p>
-    <w:p>
-      <w:r>
-        <w:t xml:space="preserve">    'TT_Close',</w:t>
-      </w:r>
-    </w:p>
-    <w:p>
-      <w:r>
-        <w:t xml:space="preserve">    'Close Trouble Ticket',</w:t>
-      </w:r>
-    </w:p>
-    <w:p>
-      <w:r>
-        <w:t xml:space="preserve">    TRUE</w:t>
+        <w:t>SELECT</w:t>
+      </w:r>
+    </w:p>
+    <w:p>
+      <w:r>
+        <w:t xml:space="preserve">    r.id,</w:t>
+      </w:r>
+    </w:p>
+    <w:p>
+      <w:r>
+        <w:t xml:space="preserve">    p.id</w:t>
+      </w:r>
+    </w:p>
+    <w:p>
+      <w:r>
+        <w:t>FROM public.auth_roles AS r</w:t>
+      </w:r>
+    </w:p>
+    <w:p>
+      <w:r>
+        <w:t>CROSS JOIN public.auth_permissions AS p</w:t>
+      </w:r>
+    </w:p>
+    <w:p>
+      <w:r>
+        <w:t>WHERE r.code IN (</w:t>
+      </w:r>
+    </w:p>
+    <w:p>
+      <w:r>
+        <w:t xml:space="preserve">    'ROOT',</w:t>
+      </w:r>
+    </w:p>
+    <w:p>
+      <w:r>
+        <w:t xml:space="preserve">    'IT_ADMIN',</w:t>
+      </w:r>
+    </w:p>
+    <w:p>
+      <w:r>
+        <w:t xml:space="preserve">    'IT_PERSONNEL'</w:t>
       </w:r>
     </w:p>
     <w:p>
@@ -312,43 +409,81 @@
     </w:p>
     <w:p>
       <w:r>
-        <w:t>ON CONFLICT (code)</w:t>
-      </w:r>
-    </w:p>
-    <w:p>
-      <w:r>
-        <w:t>DO UPDATE SET</w:t>
-      </w:r>
-    </w:p>
-    <w:p>
-      <w:r>
-        <w:t xml:space="preserve">    name = EXCLUDED.name,</w:t>
-      </w:r>
-    </w:p>
-    <w:p>
-      <w:r>
-        <w:t xml:space="preserve">    active = TRUE;</w:t>
-      </w:r>
-    </w:p>
-    <w:p/>
-    <w:p>
-      <w:r>
-        <w:t>INSERT INTO public.auth_role_permissions (</w:t>
-      </w:r>
-    </w:p>
-    <w:p>
-      <w:r>
-        <w:t xml:space="preserve">    role_id,</w:t>
-      </w:r>
-    </w:p>
-    <w:p>
-      <w:r>
-        <w:t xml:space="preserve">    permission_id</w:t>
-      </w:r>
-    </w:p>
-    <w:p>
-      <w:r>
-        <w:t>)</w:t>
+        <w:t xml:space="preserve">  AND r.active = TRUE</w:t>
+      </w:r>
+    </w:p>
+    <w:p>
+      <w:r>
+        <w:t xml:space="preserve">  AND p.code = 'TT_Close'</w:t>
+      </w:r>
+    </w:p>
+    <w:p>
+      <w:r>
+        <w:t xml:space="preserve">  AND p.active = TRUE</w:t>
+      </w:r>
+    </w:p>
+    <w:p>
+      <w:r>
+        <w:t>ON CONFLICT DO NOTHING;</w:t>
+      </w:r>
+    </w:p>
+    <w:p/>
+    <w:p>
+      <w:r>
+        <w:t>-- Safety:</w:t>
+      </w:r>
+    </w:p>
+    <w:p>
+      <w:r>
+        <w:t>-- GENERAL_USER must not have TT_Close directly.</w:t>
+      </w:r>
+    </w:p>
+    <w:p>
+      <w:r>
+        <w:t>DELETE FROM public.auth_role_permissions AS rp</w:t>
+      </w:r>
+    </w:p>
+    <w:p>
+      <w:r>
+        <w:t>USING public.auth_roles AS r,</w:t>
+      </w:r>
+    </w:p>
+    <w:p>
+      <w:r>
+        <w:t xml:space="preserve">      public.auth_permissions AS p</w:t>
+      </w:r>
+    </w:p>
+    <w:p>
+      <w:r>
+        <w:t>WHERE rp.role_id = r.id</w:t>
+      </w:r>
+    </w:p>
+    <w:p>
+      <w:r>
+        <w:t xml:space="preserve">  AND rp.permission_id = p.id</w:t>
+      </w:r>
+    </w:p>
+    <w:p>
+      <w:r>
+        <w:t xml:space="preserve">  AND r.code = 'GENERAL_USER'</w:t>
+      </w:r>
+    </w:p>
+    <w:p>
+      <w:r>
+        <w:t xml:space="preserve">  AND p.code = 'TT_Close';</w:t>
+      </w:r>
+    </w:p>
+    <w:p/>
+    <w:p>
+      <w:r>
+        <w:lastRenderedPageBreak/>
+        <w:t>COMMIT;</w:t>
+      </w:r>
+    </w:p>
+    <w:p/>
+    <w:p>
+      <w:r>
+        <w:t>-- Verification</w:t>
       </w:r>
     </w:p>
     <w:p>
@@ -358,192 +493,66 @@
     </w:p>
     <w:p>
       <w:r>
-        <w:t xml:space="preserve">    r.id,</w:t>
-      </w:r>
-    </w:p>
-    <w:p>
-      <w:r>
-        <w:t xml:space="preserve">    p.id</w:t>
-      </w:r>
-    </w:p>
-    <w:p>
-      <w:r>
-        <w:t>FROM public.auth_roles AS r</w:t>
-      </w:r>
-    </w:p>
-    <w:p>
-      <w:r>
-        <w:t>CROSS JOIN public.auth_permissions AS p</w:t>
-      </w:r>
-    </w:p>
-    <w:p>
-      <w:r>
-        <w:t>WHERE r.code IN (</w:t>
-      </w:r>
-    </w:p>
-    <w:p>
-      <w:r>
-        <w:t xml:space="preserve">    'ROOT',</w:t>
-      </w:r>
-    </w:p>
-    <w:p>
-      <w:r>
+        <w:t xml:space="preserve">    r.id AS role_id,</w:t>
+      </w:r>
+    </w:p>
+    <w:p>
+      <w:r>
+        <w:t xml:space="preserve">    r.code AS role_code,</w:t>
+      </w:r>
+    </w:p>
+    <w:p>
+      <w:r>
+        <w:t xml:space="preserve">    r.name AS role_name,</w:t>
+      </w:r>
+    </w:p>
+    <w:p>
+      <w:r>
+        <w:t xml:space="preserve">    p.code AS permission_code</w:t>
+      </w:r>
+    </w:p>
+    <w:p>
+      <w:r>
+        <w:t>FROM public.auth_role_permissions AS rp</w:t>
+      </w:r>
+    </w:p>
+    <w:p>
+      <w:r>
+        <w:t>JOIN public.auth_roles AS r</w:t>
+      </w:r>
+    </w:p>
+    <w:p>
+      <w:r>
+        <w:t xml:space="preserve">    ON r.id = rp.role_id</w:t>
+      </w:r>
+    </w:p>
+    <w:p>
+      <w:r>
+        <w:t>JOIN public.auth_permissions AS p</w:t>
+      </w:r>
+    </w:p>
+    <w:p>
+      <w:r>
+        <w:t xml:space="preserve">    ON p.id = rp.permission_id</w:t>
+      </w:r>
+    </w:p>
+    <w:p>
+      <w:r>
+        <w:t>WHERE p.code = 'TT_Close'</w:t>
+      </w:r>
+    </w:p>
+    <w:p>
+      <w:r>
+        <w:t>ORDER BY r.id;</w:t>
+      </w:r>
+    </w:p>
+    <w:p/>
+    <w:p>
+      <w:r>
+        <w:rPr>
+          <w:noProof/>
+        </w:rPr>
         <w:lastRenderedPageBreak/>
-        <w:t xml:space="preserve">    'IT_ADMIN',</w:t>
-      </w:r>
-    </w:p>
-    <w:p>
-      <w:r>
-        <w:t xml:space="preserve">    'IT_PERSONNEL'</w:t>
-      </w:r>
-    </w:p>
-    <w:p>
-      <w:r>
-        <w:t>)</w:t>
-      </w:r>
-    </w:p>
-    <w:p>
-      <w:r>
-        <w:t xml:space="preserve">  AND r.active = TRUE</w:t>
-      </w:r>
-    </w:p>
-    <w:p>
-      <w:r>
-        <w:t xml:space="preserve">  AND p.code = 'TT_Close'</w:t>
-      </w:r>
-    </w:p>
-    <w:p>
-      <w:r>
-        <w:t xml:space="preserve">  AND p.active = TRUE</w:t>
-      </w:r>
-    </w:p>
-    <w:p>
-      <w:r>
-        <w:t>ON CONFLICT DO NOTHING;</w:t>
-      </w:r>
-    </w:p>
-    <w:p/>
-    <w:p>
-      <w:r>
-        <w:t>-- Safety:</w:t>
-      </w:r>
-    </w:p>
-    <w:p>
-      <w:r>
-        <w:t>-- GENERAL_USER must not have TT_Close directly.</w:t>
-      </w:r>
-    </w:p>
-    <w:p>
-      <w:r>
-        <w:t>DELETE FROM public.auth_role_permissions AS rp</w:t>
-      </w:r>
-    </w:p>
-    <w:p>
-      <w:r>
-        <w:t>USING public.auth_roles AS r,</w:t>
-      </w:r>
-    </w:p>
-    <w:p>
-      <w:r>
-        <w:t xml:space="preserve">      public.auth_permissions AS p</w:t>
-      </w:r>
-    </w:p>
-    <w:p>
-      <w:r>
-        <w:t>WHERE rp.role_id = r.id</w:t>
-      </w:r>
-    </w:p>
-    <w:p>
-      <w:r>
-        <w:t xml:space="preserve">  AND rp.permission_id = p.id</w:t>
-      </w:r>
-    </w:p>
-    <w:p>
-      <w:r>
-        <w:t xml:space="preserve">  AND r.code = 'GENERAL_USER'</w:t>
-      </w:r>
-    </w:p>
-    <w:p>
-      <w:r>
-        <w:t xml:space="preserve">  AND p.code = 'TT_Close';</w:t>
-      </w:r>
-    </w:p>
-    <w:p/>
-    <w:p>
-      <w:r>
-        <w:t>COMMIT;</w:t>
-      </w:r>
-    </w:p>
-    <w:p/>
-    <w:p>
-      <w:r>
-        <w:t>-- Verification</w:t>
-      </w:r>
-    </w:p>
-    <w:p>
-      <w:r>
-        <w:t>SELECT</w:t>
-      </w:r>
-    </w:p>
-    <w:p>
-      <w:r>
-        <w:t xml:space="preserve">    r.id AS role_id,</w:t>
-      </w:r>
-    </w:p>
-    <w:p>
-      <w:r>
-        <w:t xml:space="preserve">    r.code AS role_code,</w:t>
-      </w:r>
-    </w:p>
-    <w:p>
-      <w:r>
-        <w:t xml:space="preserve">    r.name AS role_name,</w:t>
-      </w:r>
-    </w:p>
-    <w:p>
-      <w:r>
-        <w:t xml:space="preserve">    p.code AS permission_code</w:t>
-      </w:r>
-    </w:p>
-    <w:p>
-      <w:r>
-        <w:lastRenderedPageBreak/>
-        <w:t>FROM public.auth_role_permissions AS rp</w:t>
-      </w:r>
-    </w:p>
-    <w:p>
-      <w:r>
-        <w:t>JOIN public.auth_roles AS r</w:t>
-      </w:r>
-    </w:p>
-    <w:p>
-      <w:r>
-        <w:t xml:space="preserve">    ON r.id = rp.role_id</w:t>
-      </w:r>
-    </w:p>
-    <w:p>
-      <w:r>
-        <w:t>JOIN public.auth_permissions AS p</w:t>
-      </w:r>
-    </w:p>
-    <w:p>
-      <w:r>
-        <w:t xml:space="preserve">    ON p.id = rp.permission_id</w:t>
-      </w:r>
-    </w:p>
-    <w:p>
-      <w:r>
-        <w:t>WHERE p.code = 'TT_Close'</w:t>
-      </w:r>
-    </w:p>
-    <w:p>
-      <w:r>
-        <w:t>ORDER BY r.id;</w:t>
-      </w:r>
-    </w:p>
-    <w:p/>
-    <w:p>
-      <w:r>
         <w:drawing>
           <wp:inline distT="0" distB="0" distL="0" distR="0" wp14:anchorId="0E2A959A" wp14:editId="7D2C677A">
             <wp:extent cx="5943600" cy="3164205"/>
@@ -586,7 +595,9 @@
     <w:p/>
     <w:p>
       <w:r>
-        <w:lastRenderedPageBreak/>
+        <w:rPr>
+          <w:noProof/>
+        </w:rPr>
         <w:drawing>
           <wp:inline distT="0" distB="0" distL="0" distR="0" wp14:anchorId="7ACD8A42" wp14:editId="3A3E0C19">
             <wp:extent cx="4115157" cy="3817951"/>
@@ -640,6 +651,9 @@
     <w:p/>
     <w:p>
       <w:r>
+        <w:rPr>
+          <w:noProof/>
+        </w:rPr>
         <w:drawing>
           <wp:inline distT="0" distB="0" distL="0" distR="0" wp14:anchorId="7E6F812E" wp14:editId="16BBB973">
             <wp:extent cx="5006774" cy="3711262"/>
@@ -747,63 +761,63 @@
     </w:p>
     <w:p>
       <w:r>
+        <w:t xml:space="preserve">     | ^^^^^^^^</w:t>
+      </w:r>
+    </w:p>
+    <w:p>
+      <w:r>
+        <w:t>&gt; 30 |     columns,</w:t>
+      </w:r>
+    </w:p>
+    <w:p>
+      <w:r>
+        <w:t xml:space="preserve">     | ^^^^^^^^^^^^</w:t>
+      </w:r>
+    </w:p>
+    <w:p>
+      <w:r>
+        <w:t>&gt; 31 |     toSection,</w:t>
+      </w:r>
+    </w:p>
+    <w:p>
+      <w:r>
+        <w:t xml:space="preserve">     | ^^^^^^^^^^^^</w:t>
+      </w:r>
+    </w:p>
+    <w:p>
+      <w:r>
+        <w:t>&gt; 32 | } from "@/components/tt-columns";</w:t>
+      </w:r>
+    </w:p>
+    <w:p>
+      <w:r>
+        <w:t xml:space="preserve">     | ^^^^^^^^^^^^^^^^^^^^^^^^^^^^^^^^^^</w:t>
+      </w:r>
+    </w:p>
+    <w:p>
+      <w:r>
+        <w:t xml:space="preserve">  33 |</w:t>
+      </w:r>
+    </w:p>
+    <w:p>
+      <w:r>
+        <w:t xml:space="preserve">  34 |</w:t>
+      </w:r>
+    </w:p>
+    <w:p>
+      <w:r>
+        <w:t xml:space="preserve">  35 | import {</w:t>
+      </w:r>
+    </w:p>
+    <w:p/>
+    <w:p>
+      <w:r>
+        <w:t>The export columns was not found in module [project]/components/tt-columns.tsx [app-client] (ecmascript).</w:t>
+      </w:r>
+    </w:p>
+    <w:p>
+      <w:r>
         <w:lastRenderedPageBreak/>
-        <w:t xml:space="preserve">     | ^^^^^^^^</w:t>
-      </w:r>
-    </w:p>
-    <w:p>
-      <w:r>
-        <w:t>&gt; 30 |     columns,</w:t>
-      </w:r>
-    </w:p>
-    <w:p>
-      <w:r>
-        <w:t xml:space="preserve">     | ^^^^^^^^^^^^</w:t>
-      </w:r>
-    </w:p>
-    <w:p>
-      <w:r>
-        <w:t>&gt; 31 |     toSection,</w:t>
-      </w:r>
-    </w:p>
-    <w:p>
-      <w:r>
-        <w:t xml:space="preserve">     | ^^^^^^^^^^^^</w:t>
-      </w:r>
-    </w:p>
-    <w:p>
-      <w:r>
-        <w:t>&gt; 32 | } from "@/components/tt-columns";</w:t>
-      </w:r>
-    </w:p>
-    <w:p>
-      <w:r>
-        <w:t xml:space="preserve">     | ^^^^^^^^^^^^^^^^^^^^^^^^^^^^^^^^^^</w:t>
-      </w:r>
-    </w:p>
-    <w:p>
-      <w:r>
-        <w:t xml:space="preserve">  33 |</w:t>
-      </w:r>
-    </w:p>
-    <w:p>
-      <w:r>
-        <w:t xml:space="preserve">  34 |</w:t>
-      </w:r>
-    </w:p>
-    <w:p>
-      <w:r>
-        <w:t xml:space="preserve">  35 | import {</w:t>
-      </w:r>
-    </w:p>
-    <w:p/>
-    <w:p>
-      <w:r>
-        <w:t>The export columns was not found in module [project]/components/tt-columns.tsx [app-client] (ecmascript).</w:t>
-      </w:r>
-    </w:p>
-    <w:p>
-      <w:r>
         <w:t>Did you mean to import toSection?</w:t>
       </w:r>
     </w:p>
@@ -861,6 +875,10 @@
     <w:p/>
     <w:p>
       <w:r>
+        <w:rPr>
+          <w:noProof/>
+        </w:rPr>
+        <w:lastRenderedPageBreak/>
         <w:drawing>
           <wp:inline distT="0" distB="0" distL="0" distR="0" wp14:anchorId="171D5A71" wp14:editId="08928F08">
             <wp:extent cx="5943600" cy="4300855"/>
@@ -910,6 +928,10 @@
     <w:p/>
     <w:p>
       <w:r>
+        <w:rPr>
+          <w:noProof/>
+        </w:rPr>
+        <w:lastRenderedPageBreak/>
         <w:drawing>
           <wp:inline distT="0" distB="0" distL="0" distR="0" wp14:anchorId="168C98AD" wp14:editId="7E720F62">
             <wp:extent cx="5943600" cy="3248660"/>
@@ -968,6 +990,9 @@
         <w:br/>
       </w:r>
       <w:r>
+        <w:rPr>
+          <w:noProof/>
+        </w:rPr>
         <w:drawing>
           <wp:inline distT="0" distB="0" distL="0" distR="0" wp14:anchorId="6EC40D6A" wp14:editId="1B82DFEB">
             <wp:extent cx="5943600" cy="3044825"/>
@@ -1007,7 +1032,46 @@
     </w:p>
     <w:p/>
     <w:p/>
-    <w:p/>
+    <w:p>
+      <w:r>
+        <w:lastRenderedPageBreak/>
+        <w:drawing>
+          <wp:inline distT="0" distB="0" distL="0" distR="0" wp14:anchorId="62CF84F9" wp14:editId="4F8FA6F8">
+            <wp:extent cx="5943600" cy="3184525"/>
+            <wp:effectExtent l="0" t="0" r="0" b="0"/>
+            <wp:docPr id="936146150" name="Picture 1"/>
+            <wp:cNvGraphicFramePr>
+              <a:graphicFrameLocks xmlns:a="http://schemas.openxmlformats.org/drawingml/2006/main" noChangeAspect="1"/>
+            </wp:cNvGraphicFramePr>
+            <a:graphic xmlns:a="http://schemas.openxmlformats.org/drawingml/2006/main">
+              <a:graphicData uri="http://schemas.openxmlformats.org/drawingml/2006/picture">
+                <pic:pic xmlns:pic="http://schemas.openxmlformats.org/drawingml/2006/picture">
+                  <pic:nvPicPr>
+                    <pic:cNvPr id="936146150" name=""/>
+                    <pic:cNvPicPr/>
+                  </pic:nvPicPr>
+                  <pic:blipFill>
+                    <a:blip r:embed="rId14"/>
+                    <a:stretch>
+                      <a:fillRect/>
+                    </a:stretch>
+                  </pic:blipFill>
+                  <pic:spPr>
+                    <a:xfrm>
+                      <a:off x="0" y="0"/>
+                      <a:ext cx="5943600" cy="3184525"/>
+                    </a:xfrm>
+                    <a:prstGeom prst="rect">
+                      <a:avLst/>
+                    </a:prstGeom>
+                  </pic:spPr>
+                </pic:pic>
+              </a:graphicData>
+            </a:graphic>
+          </wp:inline>
+        </w:drawing>
+      </w:r>
+    </w:p>
     <w:p/>
     <w:p/>
     <w:p/>
@@ -1628,6 +1692,7 @@
   <w:style w:type="character" w:default="1" w:styleId="DefaultParagraphFont">
     <w:name w:val="Default Paragraph Font"/>
     <w:uiPriority w:val="1"/>
+    <w:semiHidden/>
     <w:unhideWhenUsed/>
   </w:style>
   <w:style w:type="table" w:default="1" w:styleId="TableNormal">

</xml_diff>

<commit_message>
To Redesign urgent task and TT summary widgets for better UX
</commit_message>
<xml_diff>
--- a/document/closed_tt.docx
+++ b/document/closed_tt.docx
@@ -3,25 +3,42 @@
 <w:document xmlns:wpc="http://schemas.microsoft.com/office/word/2010/wordprocessingCanvas" xmlns:cx="http://schemas.microsoft.com/office/drawing/2014/chartex" xmlns:cx1="http://schemas.microsoft.com/office/drawing/2015/9/8/chartex" xmlns:cx2="http://schemas.microsoft.com/office/drawing/2015/10/21/chartex" xmlns:cx3="http://schemas.microsoft.com/office/drawing/2016/5/9/chartex" xmlns:cx4="http://schemas.microsoft.com/office/drawing/2016/5/10/chartex" xmlns:cx5="http://schemas.microsoft.com/office/drawing/2016/5/11/chartex" xmlns:cx6="http://schemas.microsoft.com/office/drawing/2016/5/12/chartex" xmlns:cx7="http://schemas.microsoft.com/office/drawing/2016/5/13/chartex" xmlns:cx8="http://schemas.microsoft.com/office/drawing/2016/5/14/chartex" xmlns:mc="http://schemas.openxmlformats.org/markup-compatibility/2006" xmlns:aink="http://schemas.microsoft.com/office/drawing/2016/ink" xmlns:am3d="http://schemas.microsoft.com/office/drawing/2017/model3d" xmlns:o="urn:schemas-microsoft-com:office:office" xmlns:oel="http://schemas.microsoft.com/office/2019/extlst" xmlns:r="http://schemas.openxmlformats.org/officeDocument/2006/relationships" xmlns:m="http://schemas.openxmlformats.org/officeDocument/2006/math" xmlns:v="urn:schemas-microsoft-com:vml" xmlns:wp14="http://schemas.microsoft.com/office/word/2010/wordprocessingDrawing" xmlns:wp="http://schemas.openxmlformats.org/drawingml/2006/wordprocessingDrawing" xmlns:w10="urn:schemas-microsoft-com:office:word" xmlns:w="http://schemas.openxmlformats.org/wordprocessingml/2006/main" xmlns:w14="http://schemas.microsoft.com/office/word/2010/wordml" xmlns:w15="http://schemas.microsoft.com/office/word/2012/wordml" xmlns:w16cex="http://schemas.microsoft.com/office/word/2018/wordml/cex" xmlns:w16cid="http://schemas.microsoft.com/office/word/2016/wordml/cid" xmlns:w16="http://schemas.microsoft.com/office/word/2018/wordml" xmlns:w16du="http://schemas.microsoft.com/office/word/2023/wordml/word16du" xmlns:w16sdtdh="http://schemas.microsoft.com/office/word/2020/wordml/sdtdatahash" xmlns:w16sdtfl="http://schemas.microsoft.com/office/word/2024/wordml/sdtformatlock" xmlns:w16se="http://schemas.microsoft.com/office/word/2015/wordml/symex" xmlns:wpg="http://schemas.microsoft.com/office/word/2010/wordprocessingGroup" xmlns:wpi="http://schemas.microsoft.com/office/word/2010/wordprocessingInk" xmlns:wne="http://schemas.microsoft.com/office/word/2006/wordml" xmlns:wps="http://schemas.microsoft.com/office/word/2010/wordprocessingShape" mc:Ignorable="w14 w15 w16se w16cid w16 w16cex w16sdtdh w16sdtfl w16du wp14">
   <w:body>
     <w:p>
-      <w:hyperlink r:id="rId4" w:history="1">
-        <w:r>
-          <w:rPr>
-            <w:rStyle w:val="Hyperlink"/>
-          </w:rPr>
-          <w:t>https://chatgpt.com/c/6aa2469a-b218-83ee-a063-cf066ce977cc</w:t>
-        </w:r>
-      </w:hyperlink>
-    </w:p>
-    <w:p/>
-    <w:p>
-      <w:r>
-        <w:t>date : September 10, 2026</w:t>
-      </w:r>
-    </w:p>
-    <w:p>
+      <w:r>
+        <w:fldChar w:fldCharType="begin"/>
+      </w:r>
+      <w:r>
+        <w:instrText>HYPERLINK "https://chatgpt.com/c/6aa2469a-b218-83ee-a063-cf066ce977cc"</w:instrText>
+      </w:r>
+      <w:r>
+        <w:fldChar w:fldCharType="separate"/>
+      </w:r>
+      <w:r>
+        <w:rPr>
+          <w:rStyle w:val="Hyperlink"/>
+        </w:rPr>
+        <w:t>https://chatgpt.com/c/6aa2469a-b218-83ee-a063-cf066ce977cc</w:t>
+      </w:r>
+      <w:r>
+        <w:fldChar w:fldCharType="end"/>
+      </w:r>
+    </w:p>
+    <w:p/>
+    <w:p>
+      <w:proofErr w:type="gramStart"/>
+      <w:r>
+        <w:t>date :</w:t>
+      </w:r>
+      <w:proofErr w:type="gramEnd"/>
+      <w:r>
+        <w:t xml:space="preserve"> September 10, 2026</w:t>
+      </w:r>
+    </w:p>
+    <w:p>
+      <w:proofErr w:type="spellStart"/>
       <w:r>
         <w:t>Itm.root</w:t>
       </w:r>
+      <w:proofErr w:type="spellEnd"/>
     </w:p>
     <w:p>
       <w:r>
@@ -29,6 +46,30 @@
       </w:r>
     </w:p>
     <w:p/>
+    <w:p>
+      <w:proofErr w:type="spellStart"/>
+      <w:proofErr w:type="gramStart"/>
+      <w:r>
+        <w:t>saulad.alvi</w:t>
+      </w:r>
+      <w:proofErr w:type="spellEnd"/>
+      <w:proofErr w:type="gramEnd"/>
+    </w:p>
+    <w:p>
+      <w:r>
+        <w:t>016755</w:t>
+      </w:r>
+    </w:p>
+    <w:p>
+      <w:r>
+        <w:t>02-0186</w:t>
+      </w:r>
+    </w:p>
+    <w:p>
+      <w:r>
+        <w:t>--------------------------------------------------------------------</w:t>
+      </w:r>
+    </w:p>
     <w:p/>
     <w:p>
       <w:r>
@@ -48,9 +89,11 @@
       </w:pPr>
     </w:p>
     <w:p>
+      <w:proofErr w:type="spellStart"/>
       <w:r>
         <w:t>smariful</w:t>
       </w:r>
+      <w:proofErr w:type="spellEnd"/>
     </w:p>
     <w:p>
       <w:r>
@@ -68,9 +111,13 @@
       </w:r>
     </w:p>
     <w:p>
+      <w:proofErr w:type="spellStart"/>
+      <w:proofErr w:type="gramStart"/>
       <w:r>
         <w:t>shakil.khan</w:t>
       </w:r>
+      <w:proofErr w:type="spellEnd"/>
+      <w:proofErr w:type="gramEnd"/>
     </w:p>
     <w:p>
       <w:r>
@@ -86,9 +133,13 @@
     </w:p>
     <w:p/>
     <w:p>
+      <w:proofErr w:type="spellStart"/>
+      <w:proofErr w:type="gramStart"/>
       <w:r>
         <w:t>nur.hosen</w:t>
       </w:r>
+      <w:proofErr w:type="spellEnd"/>
+      <w:proofErr w:type="gramEnd"/>
     </w:p>
     <w:p>
       <w:r>
@@ -104,9 +155,14 @@
     </w:p>
     <w:p/>
     <w:p>
-      <w:r>
+      <w:proofErr w:type="spellStart"/>
+      <w:proofErr w:type="gramStart"/>
+      <w:r>
+        <w:lastRenderedPageBreak/>
         <w:t>limon.miah</w:t>
       </w:r>
+      <w:proofErr w:type="spellEnd"/>
+      <w:proofErr w:type="gramEnd"/>
     </w:p>
     <w:p>
       <w:r>
@@ -115,7 +171,7 @@
     </w:p>
     <w:p/>
     <w:p>
-      <w:hyperlink r:id="rId5" w:history="1">
+      <w:hyperlink r:id="rId4" w:history="1">
         <w:r>
           <w:rPr>
             <w:rStyle w:val="Hyperlink"/>
@@ -126,9 +182,15 @@
     </w:p>
     <w:p/>
     <w:p>
-      <w:r>
-        <w:t>Date : 10</w:t>
-      </w:r>
+      <w:proofErr w:type="gramStart"/>
+      <w:r>
+        <w:t>Date :</w:t>
+      </w:r>
+      <w:proofErr w:type="gramEnd"/>
+      <w:r>
+        <w:t xml:space="preserve"> 10</w:t>
+      </w:r>
+      <w:proofErr w:type="gramStart"/>
       <w:r>
         <w:rPr>
           <w:vertAlign w:val="superscript"/>
@@ -139,13 +201,25 @@
         <w:t xml:space="preserve"> </w:t>
       </w:r>
       <w:r>
-        <w:t xml:space="preserve"> September, 2026</w:t>
-      </w:r>
-    </w:p>
-    <w:p/>
-    <w:p>
-      <w:r>
-        <w:t>select * from inventory_categories order by id desc</w:t>
+        <w:t xml:space="preserve"> September</w:t>
+      </w:r>
+      <w:proofErr w:type="gramEnd"/>
+      <w:r>
+        <w:t>, 2026</w:t>
+      </w:r>
+    </w:p>
+    <w:p/>
+    <w:p>
+      <w:r>
+        <w:t xml:space="preserve">select * from </w:t>
+      </w:r>
+      <w:proofErr w:type="spellStart"/>
+      <w:r>
+        <w:t>inventory_categories</w:t>
+      </w:r>
+      <w:proofErr w:type="spellEnd"/>
+      <w:r>
+        <w:t xml:space="preserve"> order by id desc</w:t>
       </w:r>
     </w:p>
     <w:p/>
@@ -162,8 +236,46 @@
           <w:iCs/>
           <w:color w:val="EE0000"/>
         </w:rPr>
-        <w:t>These two files  itm/frontend/components/tt-columns.tsx</w:t>
-      </w:r>
+        <w:t xml:space="preserve">These two </w:t>
+      </w:r>
+      <w:proofErr w:type="gramStart"/>
+      <w:r>
+        <w:rPr>
+          <w:i/>
+          <w:iCs/>
+          <w:color w:val="EE0000"/>
+        </w:rPr>
+        <w:t xml:space="preserve">files  </w:t>
+      </w:r>
+      <w:proofErr w:type="spellStart"/>
+      <w:r>
+        <w:rPr>
+          <w:i/>
+          <w:iCs/>
+          <w:color w:val="EE0000"/>
+        </w:rPr>
+        <w:t>itm</w:t>
+      </w:r>
+      <w:proofErr w:type="spellEnd"/>
+      <w:r>
+        <w:rPr>
+          <w:i/>
+          <w:iCs/>
+          <w:color w:val="EE0000"/>
+        </w:rPr>
+        <w:t>/frontend/components/</w:t>
+      </w:r>
+      <w:proofErr w:type="spellStart"/>
+      <w:r>
+        <w:rPr>
+          <w:i/>
+          <w:iCs/>
+          <w:color w:val="EE0000"/>
+        </w:rPr>
+        <w:t>tt-columns.tsx</w:t>
+      </w:r>
+      <w:proofErr w:type="spellEnd"/>
+      <w:proofErr w:type="gramEnd"/>
     </w:p>
     <w:p>
       <w:pPr>
@@ -179,14 +291,110 @@
           <w:iCs/>
           <w:color w:val="EE0000"/>
         </w:rPr>
-        <w:t>frontend/components/TTTable.tsx are involved in itm/backend/internal/handler/handlers.go</w:t>
-      </w:r>
-    </w:p>
-    <w:p/>
-    <w:p/>
-    <w:p>
-      <w:r>
-        <w:t>select id, employee_id, status, created_at, closed_at, closed_by, closing_description from   trouble_tickets where id ='29578'</w:t>
+        <w:t>frontend/components/</w:t>
+      </w:r>
+      <w:proofErr w:type="spellStart"/>
+      <w:r>
+        <w:rPr>
+          <w:i/>
+          <w:iCs/>
+          <w:color w:val="EE0000"/>
+        </w:rPr>
+        <w:t>TTTable.tsx</w:t>
+      </w:r>
+      <w:proofErr w:type="spellEnd"/>
+      <w:r>
+        <w:rPr>
+          <w:i/>
+          <w:iCs/>
+          <w:color w:val="EE0000"/>
+        </w:rPr>
+        <w:t xml:space="preserve"> are involved in </w:t>
+      </w:r>
+      <w:proofErr w:type="spellStart"/>
+      <w:r>
+        <w:rPr>
+          <w:i/>
+          <w:iCs/>
+          <w:color w:val="EE0000"/>
+        </w:rPr>
+        <w:t>itm</w:t>
+      </w:r>
+      <w:proofErr w:type="spellEnd"/>
+      <w:r>
+        <w:rPr>
+          <w:i/>
+          <w:iCs/>
+          <w:color w:val="EE0000"/>
+        </w:rPr>
+        <w:t>/backend/internal/handler/</w:t>
+      </w:r>
+      <w:proofErr w:type="spellStart"/>
+      <w:proofErr w:type="gramStart"/>
+      <w:r>
+        <w:rPr>
+          <w:i/>
+          <w:iCs/>
+          <w:color w:val="EE0000"/>
+        </w:rPr>
+        <w:t>handlers.go</w:t>
+      </w:r>
+      <w:proofErr w:type="spellEnd"/>
+      <w:proofErr w:type="gramEnd"/>
+    </w:p>
+    <w:p/>
+    <w:p/>
+    <w:p>
+      <w:r>
+        <w:t xml:space="preserve">select id, </w:t>
+      </w:r>
+      <w:proofErr w:type="spellStart"/>
+      <w:r>
+        <w:t>employee_id</w:t>
+      </w:r>
+      <w:proofErr w:type="spellEnd"/>
+      <w:r>
+        <w:t xml:space="preserve">, status, </w:t>
+      </w:r>
+      <w:proofErr w:type="spellStart"/>
+      <w:r>
+        <w:t>created_at</w:t>
+      </w:r>
+      <w:proofErr w:type="spellEnd"/>
+      <w:r>
+        <w:t xml:space="preserve">, </w:t>
+      </w:r>
+      <w:proofErr w:type="spellStart"/>
+      <w:r>
+        <w:t>closed_at</w:t>
+      </w:r>
+      <w:proofErr w:type="spellEnd"/>
+      <w:r>
+        <w:t xml:space="preserve">, </w:t>
+      </w:r>
+      <w:proofErr w:type="spellStart"/>
+      <w:r>
+        <w:t>closed_by</w:t>
+      </w:r>
+      <w:proofErr w:type="spellEnd"/>
+      <w:r>
+        <w:t xml:space="preserve">, </w:t>
+      </w:r>
+      <w:proofErr w:type="spellStart"/>
+      <w:r>
+        <w:t>closing_description</w:t>
+      </w:r>
+      <w:proofErr w:type="spellEnd"/>
+      <w:r>
+        <w:t xml:space="preserve"> from   </w:t>
+      </w:r>
+      <w:proofErr w:type="spellStart"/>
+      <w:r>
+        <w:t>trouble_tickets</w:t>
+      </w:r>
+      <w:proofErr w:type="spellEnd"/>
+      <w:r>
+        <w:t xml:space="preserve"> where id ='29578'</w:t>
       </w:r>
     </w:p>
     <w:p/>
@@ -195,6 +403,7 @@
         <w:rPr>
           <w:noProof/>
         </w:rPr>
+        <w:lastRenderedPageBreak/>
         <w:drawing>
           <wp:inline distT="0" distB="0" distL="0" distR="0" wp14:anchorId="069642F1" wp14:editId="4B911087">
             <wp:extent cx="5943600" cy="3150235"/>
@@ -211,7 +420,7 @@
                     <pic:cNvPicPr/>
                   </pic:nvPicPr>
                   <pic:blipFill>
-                    <a:blip r:embed="rId6"/>
+                    <a:blip r:embed="rId5"/>
                     <a:stretch>
                       <a:fillRect/>
                     </a:stretch>
@@ -236,53 +445,178 @@
     <w:p/>
     <w:p>
       <w:r>
+        <w:t xml:space="preserve">Yes, you can run this in </w:t>
+      </w:r>
+      <w:proofErr w:type="spellStart"/>
+      <w:r>
+        <w:t>pgAdmin</w:t>
+      </w:r>
+      <w:proofErr w:type="spellEnd"/>
+      <w:r>
+        <w:t>, but first confirm the actual table and column names match exactly:</w:t>
+      </w:r>
+    </w:p>
+    <w:p>
+      <w:proofErr w:type="spellStart"/>
+      <w:proofErr w:type="gramStart"/>
+      <w:r>
+        <w:t>public.auth</w:t>
+      </w:r>
+      <w:proofErr w:type="gramEnd"/>
+      <w:r>
+        <w:t>_</w:t>
+      </w:r>
+      <w:proofErr w:type="gramStart"/>
+      <w:r>
+        <w:t>permissions</w:t>
+      </w:r>
+      <w:proofErr w:type="spellEnd"/>
+      <w:r>
+        <w:t>(</w:t>
+      </w:r>
+      <w:proofErr w:type="gramEnd"/>
+      <w:r>
+        <w:t>code, name, active)</w:t>
+      </w:r>
+      <w:r>
+        <w:br/>
+      </w:r>
+      <w:proofErr w:type="spellStart"/>
+      <w:proofErr w:type="gramStart"/>
+      <w:r>
+        <w:t>public.auth</w:t>
+      </w:r>
+      <w:proofErr w:type="gramEnd"/>
+      <w:r>
+        <w:t>_role_</w:t>
+      </w:r>
+      <w:proofErr w:type="gramStart"/>
+      <w:r>
+        <w:t>permissions</w:t>
+      </w:r>
+      <w:proofErr w:type="spellEnd"/>
+      <w:r>
+        <w:t>(</w:t>
+      </w:r>
+      <w:proofErr w:type="spellStart"/>
+      <w:proofErr w:type="gramEnd"/>
+      <w:r>
+        <w:t>role_id</w:t>
+      </w:r>
+      <w:proofErr w:type="spellEnd"/>
+      <w:r>
+        <w:t xml:space="preserve">, </w:t>
+      </w:r>
+      <w:proofErr w:type="spellStart"/>
+      <w:r>
+        <w:t>permission_id</w:t>
+      </w:r>
+      <w:proofErr w:type="spellEnd"/>
+      <w:r>
+        <w:t>)</w:t>
+      </w:r>
+      <w:r>
+        <w:br/>
+      </w:r>
+      <w:proofErr w:type="spellStart"/>
+      <w:proofErr w:type="gramStart"/>
+      <w:r>
+        <w:t>public.auth</w:t>
+      </w:r>
+      <w:proofErr w:type="gramEnd"/>
+      <w:r>
+        <w:t>_</w:t>
+      </w:r>
+      <w:proofErr w:type="gramStart"/>
+      <w:r>
+        <w:t>roles</w:t>
+      </w:r>
+      <w:proofErr w:type="spellEnd"/>
+      <w:r>
+        <w:t>(</w:t>
+      </w:r>
+      <w:proofErr w:type="gramEnd"/>
+      <w:r>
+        <w:t>id, code, name, active)</w:t>
+      </w:r>
+    </w:p>
+    <w:p>
+      <w:r>
+        <w:t>If those are correct, this SQL is valid for PostgreSQL.</w:t>
+      </w:r>
+    </w:p>
+    <w:p/>
+    <w:p>
+      <w:r>
+        <w:t>BEGIN;</w:t>
+      </w:r>
+    </w:p>
+    <w:p/>
+    <w:p>
+      <w:r>
+        <w:t xml:space="preserve">INSERT INTO </w:t>
+      </w:r>
+      <w:proofErr w:type="spellStart"/>
+      <w:proofErr w:type="gramStart"/>
+      <w:r>
+        <w:t>public.auth</w:t>
+      </w:r>
+      <w:proofErr w:type="gramEnd"/>
+      <w:r>
+        <w:t>_permissions</w:t>
+      </w:r>
+      <w:proofErr w:type="spellEnd"/>
+      <w:r>
+        <w:t xml:space="preserve"> (</w:t>
+      </w:r>
+    </w:p>
+    <w:p>
+      <w:r>
+        <w:t xml:space="preserve">    code,</w:t>
+      </w:r>
+    </w:p>
+    <w:p>
+      <w:r>
+        <w:t xml:space="preserve">    name,</w:t>
+      </w:r>
+    </w:p>
+    <w:p>
+      <w:r>
+        <w:t xml:space="preserve">    active</w:t>
+      </w:r>
+    </w:p>
+    <w:p>
+      <w:r>
+        <w:t>)</w:t>
+      </w:r>
+    </w:p>
+    <w:p>
+      <w:r>
         <w:lastRenderedPageBreak/>
-        <w:t>Yes, you can run this in pgAdmin, but first confirm the actual table and column names match exactly:</w:t>
-      </w:r>
-    </w:p>
-    <w:p>
-      <w:r>
-        <w:t>public.auth_permissions(code, name, active)</w:t>
-      </w:r>
-      <w:r>
-        <w:br/>
-        <w:t>public.auth_role_permissions(role_id, permission_id)</w:t>
-      </w:r>
-      <w:r>
-        <w:br/>
-        <w:t>public.auth_roles(id, code, name, active)</w:t>
-      </w:r>
-    </w:p>
-    <w:p>
-      <w:r>
-        <w:t>If those are correct, this SQL is valid for PostgreSQL.</w:t>
-      </w:r>
-    </w:p>
-    <w:p/>
-    <w:p>
-      <w:r>
-        <w:t>BEGIN;</w:t>
-      </w:r>
-    </w:p>
-    <w:p/>
-    <w:p>
-      <w:r>
-        <w:t>INSERT INTO public.auth_permissions (</w:t>
-      </w:r>
-    </w:p>
-    <w:p>
-      <w:r>
-        <w:t xml:space="preserve">    code,</w:t>
-      </w:r>
-    </w:p>
-    <w:p>
-      <w:r>
-        <w:t xml:space="preserve">    name,</w:t>
-      </w:r>
-    </w:p>
-    <w:p>
-      <w:r>
-        <w:t xml:space="preserve">    active</w:t>
+        <w:t>VALUES (</w:t>
+      </w:r>
+    </w:p>
+    <w:p>
+      <w:r>
+        <w:t xml:space="preserve">    '</w:t>
+      </w:r>
+      <w:proofErr w:type="spellStart"/>
+      <w:r>
+        <w:t>TT_Close</w:t>
+      </w:r>
+      <w:proofErr w:type="spellEnd"/>
+      <w:r>
+        <w:t>',</w:t>
+      </w:r>
+    </w:p>
+    <w:p>
+      <w:r>
+        <w:t xml:space="preserve">    'Close Trouble Ticket',</w:t>
+      </w:r>
+    </w:p>
+    <w:p>
+      <w:r>
+        <w:t xml:space="preserve">    TRUE</w:t>
       </w:r>
     </w:p>
     <w:p>
@@ -292,23 +626,65 @@
     </w:p>
     <w:p>
       <w:r>
-        <w:t>VALUES (</w:t>
-      </w:r>
-    </w:p>
-    <w:p>
-      <w:r>
-        <w:t xml:space="preserve">    'TT_Close',</w:t>
-      </w:r>
-    </w:p>
-    <w:p>
-      <w:r>
-        <w:t xml:space="preserve">    'Close Trouble Ticket',</w:t>
-      </w:r>
-    </w:p>
-    <w:p>
-      <w:r>
-        <w:t xml:space="preserve">    TRUE</w:t>
-      </w:r>
+        <w:t>ON CONFLICT (code)</w:t>
+      </w:r>
+    </w:p>
+    <w:p>
+      <w:r>
+        <w:t>DO UPDATE SET</w:t>
+      </w:r>
+    </w:p>
+    <w:p>
+      <w:r>
+        <w:t xml:space="preserve">    name = EXCLUDED.name,</w:t>
+      </w:r>
+    </w:p>
+    <w:p>
+      <w:r>
+        <w:t xml:space="preserve">    active = TRUE;</w:t>
+      </w:r>
+    </w:p>
+    <w:p/>
+    <w:p>
+      <w:r>
+        <w:t xml:space="preserve">INSERT INTO </w:t>
+      </w:r>
+      <w:proofErr w:type="spellStart"/>
+      <w:proofErr w:type="gramStart"/>
+      <w:r>
+        <w:t>public.auth</w:t>
+      </w:r>
+      <w:proofErr w:type="gramEnd"/>
+      <w:r>
+        <w:t>_role_permissions</w:t>
+      </w:r>
+      <w:proofErr w:type="spellEnd"/>
+      <w:r>
+        <w:t xml:space="preserve"> (</w:t>
+      </w:r>
+    </w:p>
+    <w:p>
+      <w:r>
+        <w:t xml:space="preserve">    </w:t>
+      </w:r>
+      <w:proofErr w:type="spellStart"/>
+      <w:r>
+        <w:t>role_id</w:t>
+      </w:r>
+      <w:proofErr w:type="spellEnd"/>
+      <w:r>
+        <w:t>,</w:t>
+      </w:r>
+    </w:p>
+    <w:p>
+      <w:r>
+        <w:t xml:space="preserve">    </w:t>
+      </w:r>
+      <w:proofErr w:type="spellStart"/>
+      <w:r>
+        <w:t>permission_id</w:t>
+      </w:r>
+      <w:proofErr w:type="spellEnd"/>
     </w:p>
     <w:p>
       <w:r>
@@ -317,44 +693,311 @@
     </w:p>
     <w:p>
       <w:r>
-        <w:t>ON CONFLICT (code)</w:t>
-      </w:r>
-    </w:p>
-    <w:p>
-      <w:r>
-        <w:t>DO UPDATE SET</w:t>
-      </w:r>
-    </w:p>
-    <w:p>
-      <w:r>
-        <w:t xml:space="preserve">    name = EXCLUDED.name,</w:t>
-      </w:r>
-    </w:p>
-    <w:p>
-      <w:r>
-        <w:t xml:space="preserve">    active = TRUE;</w:t>
-      </w:r>
-    </w:p>
-    <w:p/>
-    <w:p>
-      <w:r>
-        <w:t>INSERT INTO public.auth_role_permissions (</w:t>
-      </w:r>
-    </w:p>
-    <w:p>
-      <w:r>
-        <w:t xml:space="preserve">    role_id,</w:t>
-      </w:r>
-    </w:p>
-    <w:p>
-      <w:r>
-        <w:t xml:space="preserve">    permission_id</w:t>
+        <w:t>SELECT</w:t>
+      </w:r>
+    </w:p>
+    <w:p>
+      <w:r>
+        <w:t xml:space="preserve">    r.id,</w:t>
+      </w:r>
+    </w:p>
+    <w:p>
+      <w:r>
+        <w:t xml:space="preserve">    p.id</w:t>
+      </w:r>
+    </w:p>
+    <w:p>
+      <w:r>
+        <w:t xml:space="preserve">FROM </w:t>
+      </w:r>
+      <w:proofErr w:type="spellStart"/>
+      <w:proofErr w:type="gramStart"/>
+      <w:r>
+        <w:t>public.auth</w:t>
+      </w:r>
+      <w:proofErr w:type="gramEnd"/>
+      <w:r>
+        <w:t>_roles</w:t>
+      </w:r>
+      <w:proofErr w:type="spellEnd"/>
+      <w:r>
+        <w:t xml:space="preserve"> AS r</w:t>
+      </w:r>
+    </w:p>
+    <w:p>
+      <w:r>
+        <w:t xml:space="preserve">CROSS JOIN </w:t>
+      </w:r>
+      <w:proofErr w:type="spellStart"/>
+      <w:proofErr w:type="gramStart"/>
+      <w:r>
+        <w:t>public.auth</w:t>
+      </w:r>
+      <w:proofErr w:type="gramEnd"/>
+      <w:r>
+        <w:t>_permissions</w:t>
+      </w:r>
+      <w:proofErr w:type="spellEnd"/>
+      <w:r>
+        <w:t xml:space="preserve"> AS p</w:t>
+      </w:r>
+    </w:p>
+    <w:p>
+      <w:r>
+        <w:t xml:space="preserve">WHERE </w:t>
+      </w:r>
+      <w:proofErr w:type="spellStart"/>
+      <w:proofErr w:type="gramStart"/>
+      <w:r>
+        <w:t>r.code</w:t>
+      </w:r>
+      <w:proofErr w:type="spellEnd"/>
+      <w:proofErr w:type="gramEnd"/>
+      <w:r>
+        <w:t xml:space="preserve"> IN (</w:t>
+      </w:r>
+    </w:p>
+    <w:p>
+      <w:r>
+        <w:t xml:space="preserve">    'ROOT',</w:t>
+      </w:r>
+    </w:p>
+    <w:p>
+      <w:r>
+        <w:t xml:space="preserve">    'IT_ADMIN',</w:t>
+      </w:r>
+    </w:p>
+    <w:p>
+      <w:r>
+        <w:t xml:space="preserve">    'IT_PERSONNEL'</w:t>
+      </w:r>
+    </w:p>
+    <w:p>
+      <w:r>
+        <w:t>)</w:t>
+      </w:r>
+    </w:p>
+    <w:p>
+      <w:r>
+        <w:t xml:space="preserve">  AND </w:t>
+      </w:r>
+      <w:proofErr w:type="spellStart"/>
+      <w:proofErr w:type="gramStart"/>
+      <w:r>
+        <w:t>r.active</w:t>
+      </w:r>
+      <w:proofErr w:type="spellEnd"/>
+      <w:proofErr w:type="gramEnd"/>
+      <w:r>
+        <w:t xml:space="preserve"> = TRUE</w:t>
+      </w:r>
+    </w:p>
+    <w:p>
+      <w:r>
+        <w:t xml:space="preserve">  AND </w:t>
+      </w:r>
+      <w:proofErr w:type="spellStart"/>
+      <w:proofErr w:type="gramStart"/>
+      <w:r>
+        <w:t>p.code</w:t>
+      </w:r>
+      <w:proofErr w:type="spellEnd"/>
+      <w:proofErr w:type="gramEnd"/>
+      <w:r>
+        <w:t xml:space="preserve"> = '</w:t>
+      </w:r>
+      <w:proofErr w:type="spellStart"/>
+      <w:r>
+        <w:t>TT_Close</w:t>
+      </w:r>
+      <w:proofErr w:type="spellEnd"/>
+      <w:r>
+        <w:t>'</w:t>
       </w:r>
     </w:p>
     <w:p>
       <w:r>
         <w:lastRenderedPageBreak/>
-        <w:t>)</w:t>
+        <w:t xml:space="preserve">  AND </w:t>
+      </w:r>
+      <w:proofErr w:type="spellStart"/>
+      <w:proofErr w:type="gramStart"/>
+      <w:r>
+        <w:t>p.active</w:t>
+      </w:r>
+      <w:proofErr w:type="spellEnd"/>
+      <w:proofErr w:type="gramEnd"/>
+      <w:r>
+        <w:t xml:space="preserve"> = TRUE</w:t>
+      </w:r>
+    </w:p>
+    <w:p>
+      <w:r>
+        <w:t>ON CONFLICT DO NOTHING;</w:t>
+      </w:r>
+    </w:p>
+    <w:p/>
+    <w:p>
+      <w:r>
+        <w:t>-- Safety:</w:t>
+      </w:r>
+    </w:p>
+    <w:p>
+      <w:r>
+        <w:t xml:space="preserve">-- GENERAL_USER must not have </w:t>
+      </w:r>
+      <w:proofErr w:type="spellStart"/>
+      <w:r>
+        <w:t>TT_Close</w:t>
+      </w:r>
+      <w:proofErr w:type="spellEnd"/>
+      <w:r>
+        <w:t xml:space="preserve"> directly.</w:t>
+      </w:r>
+    </w:p>
+    <w:p>
+      <w:r>
+        <w:t xml:space="preserve">DELETE FROM </w:t>
+      </w:r>
+      <w:proofErr w:type="spellStart"/>
+      <w:proofErr w:type="gramStart"/>
+      <w:r>
+        <w:t>public.auth</w:t>
+      </w:r>
+      <w:proofErr w:type="gramEnd"/>
+      <w:r>
+        <w:t>_role_permissions</w:t>
+      </w:r>
+      <w:proofErr w:type="spellEnd"/>
+      <w:r>
+        <w:t xml:space="preserve"> AS </w:t>
+      </w:r>
+      <w:proofErr w:type="spellStart"/>
+      <w:r>
+        <w:t>rp</w:t>
+      </w:r>
+      <w:proofErr w:type="spellEnd"/>
+    </w:p>
+    <w:p>
+      <w:r>
+        <w:t xml:space="preserve">USING </w:t>
+      </w:r>
+      <w:proofErr w:type="spellStart"/>
+      <w:proofErr w:type="gramStart"/>
+      <w:r>
+        <w:t>public.auth</w:t>
+      </w:r>
+      <w:proofErr w:type="gramEnd"/>
+      <w:r>
+        <w:t>_roles</w:t>
+      </w:r>
+      <w:proofErr w:type="spellEnd"/>
+      <w:r>
+        <w:t xml:space="preserve"> AS r,</w:t>
+      </w:r>
+    </w:p>
+    <w:p>
+      <w:r>
+        <w:t xml:space="preserve">      </w:t>
+      </w:r>
+      <w:proofErr w:type="spellStart"/>
+      <w:proofErr w:type="gramStart"/>
+      <w:r>
+        <w:t>public.auth</w:t>
+      </w:r>
+      <w:proofErr w:type="gramEnd"/>
+      <w:r>
+        <w:t>_permissions</w:t>
+      </w:r>
+      <w:proofErr w:type="spellEnd"/>
+      <w:r>
+        <w:t xml:space="preserve"> AS p</w:t>
+      </w:r>
+    </w:p>
+    <w:p>
+      <w:r>
+        <w:t xml:space="preserve">WHERE </w:t>
+      </w:r>
+      <w:proofErr w:type="spellStart"/>
+      <w:proofErr w:type="gramStart"/>
+      <w:r>
+        <w:t>rp.role</w:t>
+      </w:r>
+      <w:proofErr w:type="gramEnd"/>
+      <w:r>
+        <w:t>_id</w:t>
+      </w:r>
+      <w:proofErr w:type="spellEnd"/>
+      <w:r>
+        <w:t xml:space="preserve"> = r.id</w:t>
+      </w:r>
+    </w:p>
+    <w:p>
+      <w:r>
+        <w:t xml:space="preserve">  AND </w:t>
+      </w:r>
+      <w:proofErr w:type="spellStart"/>
+      <w:proofErr w:type="gramStart"/>
+      <w:r>
+        <w:t>rp.permission</w:t>
+      </w:r>
+      <w:proofErr w:type="gramEnd"/>
+      <w:r>
+        <w:t>_id</w:t>
+      </w:r>
+      <w:proofErr w:type="spellEnd"/>
+      <w:r>
+        <w:t xml:space="preserve"> = p.id</w:t>
+      </w:r>
+    </w:p>
+    <w:p>
+      <w:r>
+        <w:t xml:space="preserve">  AND </w:t>
+      </w:r>
+      <w:proofErr w:type="spellStart"/>
+      <w:proofErr w:type="gramStart"/>
+      <w:r>
+        <w:t>r.code</w:t>
+      </w:r>
+      <w:proofErr w:type="spellEnd"/>
+      <w:proofErr w:type="gramEnd"/>
+      <w:r>
+        <w:t xml:space="preserve"> = 'GENERAL_USER'</w:t>
+      </w:r>
+    </w:p>
+    <w:p>
+      <w:r>
+        <w:t xml:space="preserve">  AND </w:t>
+      </w:r>
+      <w:proofErr w:type="spellStart"/>
+      <w:proofErr w:type="gramStart"/>
+      <w:r>
+        <w:t>p.code</w:t>
+      </w:r>
+      <w:proofErr w:type="spellEnd"/>
+      <w:proofErr w:type="gramEnd"/>
+      <w:r>
+        <w:t xml:space="preserve"> = '</w:t>
+      </w:r>
+      <w:proofErr w:type="spellStart"/>
+      <w:r>
+        <w:t>TT_Close</w:t>
+      </w:r>
+      <w:proofErr w:type="spellEnd"/>
+      <w:r>
+        <w:t>';</w:t>
+      </w:r>
+    </w:p>
+    <w:p/>
+    <w:p>
+      <w:r>
+        <w:t>COMMIT;</w:t>
+      </w:r>
+    </w:p>
+    <w:p/>
+    <w:p>
+      <w:r>
+        <w:t>-- Verification</w:t>
       </w:r>
     </w:p>
     <w:p>
@@ -364,181 +1007,184 @@
     </w:p>
     <w:p>
       <w:r>
-        <w:t xml:space="preserve">    r.id,</w:t>
-      </w:r>
-    </w:p>
-    <w:p>
-      <w:r>
-        <w:t xml:space="preserve">    p.id</w:t>
-      </w:r>
-    </w:p>
-    <w:p>
-      <w:r>
-        <w:t>FROM public.auth_roles AS r</w:t>
-      </w:r>
-    </w:p>
-    <w:p>
-      <w:r>
-        <w:t>CROSS JOIN public.auth_permissions AS p</w:t>
-      </w:r>
-    </w:p>
-    <w:p>
-      <w:r>
-        <w:t>WHERE r.code IN (</w:t>
-      </w:r>
-    </w:p>
-    <w:p>
-      <w:r>
-        <w:t xml:space="preserve">    'ROOT',</w:t>
-      </w:r>
-    </w:p>
-    <w:p>
-      <w:r>
-        <w:t xml:space="preserve">    'IT_ADMIN',</w:t>
-      </w:r>
-    </w:p>
-    <w:p>
-      <w:r>
-        <w:t xml:space="preserve">    'IT_PERSONNEL'</w:t>
-      </w:r>
-    </w:p>
-    <w:p>
-      <w:r>
-        <w:t>)</w:t>
-      </w:r>
-    </w:p>
-    <w:p>
-      <w:r>
-        <w:t xml:space="preserve">  AND r.active = TRUE</w:t>
-      </w:r>
-    </w:p>
-    <w:p>
-      <w:r>
-        <w:t xml:space="preserve">  AND p.code = 'TT_Close'</w:t>
-      </w:r>
-    </w:p>
-    <w:p>
-      <w:r>
-        <w:t xml:space="preserve">  AND p.active = TRUE</w:t>
-      </w:r>
-    </w:p>
-    <w:p>
-      <w:r>
-        <w:t>ON CONFLICT DO NOTHING;</w:t>
-      </w:r>
-    </w:p>
-    <w:p/>
-    <w:p>
-      <w:r>
-        <w:t>-- Safety:</w:t>
-      </w:r>
-    </w:p>
-    <w:p>
-      <w:r>
-        <w:t>-- GENERAL_USER must not have TT_Close directly.</w:t>
-      </w:r>
-    </w:p>
-    <w:p>
-      <w:r>
-        <w:t>DELETE FROM public.auth_role_permissions AS rp</w:t>
-      </w:r>
-    </w:p>
-    <w:p>
-      <w:r>
-        <w:t>USING public.auth_roles AS r,</w:t>
-      </w:r>
-    </w:p>
-    <w:p>
-      <w:r>
-        <w:t xml:space="preserve">      public.auth_permissions AS p</w:t>
-      </w:r>
-    </w:p>
-    <w:p>
-      <w:r>
-        <w:t>WHERE rp.role_id = r.id</w:t>
-      </w:r>
-    </w:p>
-    <w:p>
-      <w:r>
-        <w:t xml:space="preserve">  AND rp.permission_id = p.id</w:t>
-      </w:r>
-    </w:p>
-    <w:p>
-      <w:r>
-        <w:t xml:space="preserve">  AND r.code = 'GENERAL_USER'</w:t>
-      </w:r>
-    </w:p>
-    <w:p>
-      <w:r>
-        <w:t xml:space="preserve">  AND p.code = 'TT_Close';</w:t>
-      </w:r>
-    </w:p>
-    <w:p/>
+        <w:t xml:space="preserve">    r.id AS </w:t>
+      </w:r>
+      <w:proofErr w:type="spellStart"/>
+      <w:r>
+        <w:t>role_id</w:t>
+      </w:r>
+      <w:proofErr w:type="spellEnd"/>
+      <w:r>
+        <w:t>,</w:t>
+      </w:r>
+    </w:p>
+    <w:p>
+      <w:r>
+        <w:t xml:space="preserve">    </w:t>
+      </w:r>
+      <w:proofErr w:type="spellStart"/>
+      <w:proofErr w:type="gramStart"/>
+      <w:r>
+        <w:t>r.code</w:t>
+      </w:r>
+      <w:proofErr w:type="spellEnd"/>
+      <w:proofErr w:type="gramEnd"/>
+      <w:r>
+        <w:t xml:space="preserve"> AS </w:t>
+      </w:r>
+      <w:proofErr w:type="spellStart"/>
+      <w:r>
+        <w:t>role_code</w:t>
+      </w:r>
+      <w:proofErr w:type="spellEnd"/>
+      <w:r>
+        <w:t>,</w:t>
+      </w:r>
+    </w:p>
+    <w:p>
+      <w:r>
+        <w:t xml:space="preserve">    r.name AS </w:t>
+      </w:r>
+      <w:proofErr w:type="spellStart"/>
+      <w:r>
+        <w:t>role_name</w:t>
+      </w:r>
+      <w:proofErr w:type="spellEnd"/>
+      <w:r>
+        <w:t>,</w:t>
+      </w:r>
+    </w:p>
+    <w:p>
+      <w:r>
+        <w:t xml:space="preserve">    </w:t>
+      </w:r>
+      <w:proofErr w:type="spellStart"/>
+      <w:proofErr w:type="gramStart"/>
+      <w:r>
+        <w:t>p.code</w:t>
+      </w:r>
+      <w:proofErr w:type="spellEnd"/>
+      <w:proofErr w:type="gramEnd"/>
+      <w:r>
+        <w:t xml:space="preserve"> AS </w:t>
+      </w:r>
+      <w:proofErr w:type="spellStart"/>
+      <w:r>
+        <w:t>permission_code</w:t>
+      </w:r>
+      <w:proofErr w:type="spellEnd"/>
+    </w:p>
+    <w:p>
+      <w:r>
+        <w:t xml:space="preserve">FROM </w:t>
+      </w:r>
+      <w:proofErr w:type="spellStart"/>
+      <w:proofErr w:type="gramStart"/>
+      <w:r>
+        <w:t>public.auth</w:t>
+      </w:r>
+      <w:proofErr w:type="gramEnd"/>
+      <w:r>
+        <w:t>_role_permissions</w:t>
+      </w:r>
+      <w:proofErr w:type="spellEnd"/>
+      <w:r>
+        <w:t xml:space="preserve"> AS </w:t>
+      </w:r>
+      <w:proofErr w:type="spellStart"/>
+      <w:r>
+        <w:t>rp</w:t>
+      </w:r>
+      <w:proofErr w:type="spellEnd"/>
+    </w:p>
+    <w:p>
+      <w:r>
+        <w:t xml:space="preserve">JOIN </w:t>
+      </w:r>
+      <w:proofErr w:type="spellStart"/>
+      <w:proofErr w:type="gramStart"/>
+      <w:r>
+        <w:t>public.auth</w:t>
+      </w:r>
+      <w:proofErr w:type="gramEnd"/>
+      <w:r>
+        <w:t>_roles</w:t>
+      </w:r>
+      <w:proofErr w:type="spellEnd"/>
+      <w:r>
+        <w:t xml:space="preserve"> AS r</w:t>
+      </w:r>
+    </w:p>
+    <w:p>
+      <w:r>
+        <w:t xml:space="preserve">    ON r.id = </w:t>
+      </w:r>
+      <w:proofErr w:type="spellStart"/>
+      <w:proofErr w:type="gramStart"/>
+      <w:r>
+        <w:t>rp.role</w:t>
+      </w:r>
+      <w:proofErr w:type="gramEnd"/>
+      <w:r>
+        <w:t>_id</w:t>
+      </w:r>
+      <w:proofErr w:type="spellEnd"/>
+    </w:p>
+    <w:p>
+      <w:r>
+        <w:t xml:space="preserve">JOIN </w:t>
+      </w:r>
+      <w:proofErr w:type="spellStart"/>
+      <w:proofErr w:type="gramStart"/>
+      <w:r>
+        <w:t>public.auth</w:t>
+      </w:r>
+      <w:proofErr w:type="gramEnd"/>
+      <w:r>
+        <w:t>_permissions</w:t>
+      </w:r>
+      <w:proofErr w:type="spellEnd"/>
+      <w:r>
+        <w:t xml:space="preserve"> AS p</w:t>
+      </w:r>
+    </w:p>
+    <w:p>
+      <w:r>
+        <w:t xml:space="preserve">    ON p.id = </w:t>
+      </w:r>
+      <w:proofErr w:type="spellStart"/>
+      <w:proofErr w:type="gramStart"/>
+      <w:r>
+        <w:t>rp.permission</w:t>
+      </w:r>
+      <w:proofErr w:type="gramEnd"/>
+      <w:r>
+        <w:t>_id</w:t>
+      </w:r>
+      <w:proofErr w:type="spellEnd"/>
+    </w:p>
     <w:p>
       <w:r>
         <w:lastRenderedPageBreak/>
-        <w:t>COMMIT;</w:t>
-      </w:r>
-    </w:p>
-    <w:p/>
-    <w:p>
-      <w:r>
-        <w:t>-- Verification</w:t>
-      </w:r>
-    </w:p>
-    <w:p>
-      <w:r>
-        <w:t>SELECT</w:t>
-      </w:r>
-    </w:p>
-    <w:p>
-      <w:r>
-        <w:t xml:space="preserve">    r.id AS role_id,</w:t>
-      </w:r>
-    </w:p>
-    <w:p>
-      <w:r>
-        <w:t xml:space="preserve">    r.code AS role_code,</w:t>
-      </w:r>
-    </w:p>
-    <w:p>
-      <w:r>
-        <w:t xml:space="preserve">    r.name AS role_name,</w:t>
-      </w:r>
-    </w:p>
-    <w:p>
-      <w:r>
-        <w:t xml:space="preserve">    p.code AS permission_code</w:t>
-      </w:r>
-    </w:p>
-    <w:p>
-      <w:r>
-        <w:t>FROM public.auth_role_permissions AS rp</w:t>
-      </w:r>
-    </w:p>
-    <w:p>
-      <w:r>
-        <w:t>JOIN public.auth_roles AS r</w:t>
-      </w:r>
-    </w:p>
-    <w:p>
-      <w:r>
-        <w:t xml:space="preserve">    ON r.id = rp.role_id</w:t>
-      </w:r>
-    </w:p>
-    <w:p>
-      <w:r>
-        <w:t>JOIN public.auth_permissions AS p</w:t>
-      </w:r>
-    </w:p>
-    <w:p>
-      <w:r>
-        <w:t xml:space="preserve">    ON p.id = rp.permission_id</w:t>
-      </w:r>
-    </w:p>
-    <w:p>
-      <w:r>
-        <w:t>WHERE p.code = 'TT_Close'</w:t>
+        <w:t xml:space="preserve">WHERE </w:t>
+      </w:r>
+      <w:proofErr w:type="spellStart"/>
+      <w:proofErr w:type="gramStart"/>
+      <w:r>
+        <w:t>p.code</w:t>
+      </w:r>
+      <w:proofErr w:type="spellEnd"/>
+      <w:proofErr w:type="gramEnd"/>
+      <w:r>
+        <w:t xml:space="preserve"> = '</w:t>
+      </w:r>
+      <w:proofErr w:type="spellStart"/>
+      <w:r>
+        <w:t>TT_Close</w:t>
+      </w:r>
+      <w:proofErr w:type="spellEnd"/>
+      <w:r>
+        <w:t>'</w:t>
       </w:r>
     </w:p>
     <w:p>
@@ -552,7 +1198,6 @@
         <w:rPr>
           <w:noProof/>
         </w:rPr>
-        <w:lastRenderedPageBreak/>
         <w:drawing>
           <wp:inline distT="0" distB="0" distL="0" distR="0" wp14:anchorId="0E2A959A" wp14:editId="7D2C677A">
             <wp:extent cx="5943600" cy="3164205"/>
@@ -569,7 +1214,7 @@
                     <pic:cNvPicPr/>
                   </pic:nvPicPr>
                   <pic:blipFill>
-                    <a:blip r:embed="rId7"/>
+                    <a:blip r:embed="rId6"/>
                     <a:stretch>
                       <a:fillRect/>
                     </a:stretch>
@@ -598,6 +1243,7 @@
         <w:rPr>
           <w:noProof/>
         </w:rPr>
+        <w:lastRenderedPageBreak/>
         <w:drawing>
           <wp:inline distT="0" distB="0" distL="0" distR="0" wp14:anchorId="7ACD8A42" wp14:editId="3A3E0C19">
             <wp:extent cx="4115157" cy="3817951"/>
@@ -614,7 +1260,7 @@
                     <pic:cNvPicPr/>
                   </pic:nvPicPr>
                   <pic:blipFill>
-                    <a:blip r:embed="rId8"/>
+                    <a:blip r:embed="rId7"/>
                     <a:stretch>
                       <a:fillRect/>
                     </a:stretch>
@@ -670,7 +1316,7 @@
                     <pic:cNvPicPr/>
                   </pic:nvPicPr>
                   <pic:blipFill>
-                    <a:blip r:embed="rId9"/>
+                    <a:blip r:embed="rId8"/>
                     <a:stretch>
                       <a:fillRect/>
                     </a:stretch>
@@ -710,7 +1356,7 @@
     </w:p>
     <w:p/>
     <w:p>
-      <w:hyperlink r:id="rId10" w:history="1">
+      <w:hyperlink r:id="rId9" w:history="1">
         <w:r>
           <w:rPr>
             <w:rStyle w:val="Hyperlink"/>
@@ -731,17 +1377,41 @@
     </w:p>
     <w:p>
       <w:r>
-        <w:t>Export columns doesn't exist in target module</w:t>
-      </w:r>
-    </w:p>
-    <w:p>
-      <w:r>
-        <w:t>./app/dashboard/trouble-tickets/page.tsx (29:1)</w:t>
-      </w:r>
-    </w:p>
-    <w:p>
-      <w:r>
-        <w:t>Export columns doesn't exist in target module</w:t>
+        <w:t xml:space="preserve">Export columns </w:t>
+      </w:r>
+      <w:proofErr w:type="gramStart"/>
+      <w:r>
+        <w:t>doesn't</w:t>
+      </w:r>
+      <w:proofErr w:type="gramEnd"/>
+      <w:r>
+        <w:t xml:space="preserve"> exist in target module</w:t>
+      </w:r>
+    </w:p>
+    <w:p>
+      <w:r>
+        <w:t>./app/dashboard/trouble-tickets/</w:t>
+      </w:r>
+      <w:proofErr w:type="spellStart"/>
+      <w:r>
+        <w:t>page.tsx</w:t>
+      </w:r>
+      <w:proofErr w:type="spellEnd"/>
+      <w:r>
+        <w:t xml:space="preserve"> (29:1)</w:t>
+      </w:r>
+    </w:p>
+    <w:p>
+      <w:r>
+        <w:t xml:space="preserve">Export columns </w:t>
+      </w:r>
+      <w:proofErr w:type="gramStart"/>
+      <w:r>
+        <w:t>doesn't</w:t>
+      </w:r>
+      <w:proofErr w:type="gramEnd"/>
+      <w:r>
+        <w:t xml:space="preserve"> exist in target module</w:t>
       </w:r>
     </w:p>
     <w:p>
@@ -761,6 +1431,7 @@
     </w:p>
     <w:p>
       <w:r>
+        <w:lastRenderedPageBreak/>
         <w:t xml:space="preserve">     | ^^^^^^^^</w:t>
       </w:r>
     </w:p>
@@ -776,7 +1447,15 @@
     </w:p>
     <w:p>
       <w:r>
-        <w:t>&gt; 31 |     toSection,</w:t>
+        <w:t xml:space="preserve">&gt; 31 |     </w:t>
+      </w:r>
+      <w:proofErr w:type="spellStart"/>
+      <w:r>
+        <w:t>toSection</w:t>
+      </w:r>
+      <w:proofErr w:type="spellEnd"/>
+      <w:r>
+        <w:t>,</w:t>
       </w:r>
     </w:p>
     <w:p>
@@ -786,7 +1465,23 @@
     </w:p>
     <w:p>
       <w:r>
-        <w:t>&gt; 32 | } from "@/components/tt-columns";</w:t>
+        <w:t xml:space="preserve">&gt; 32 </w:t>
+      </w:r>
+      <w:proofErr w:type="gramStart"/>
+      <w:r>
+        <w:t>| }</w:t>
+      </w:r>
+      <w:proofErr w:type="gramEnd"/>
+      <w:r>
+        <w:t xml:space="preserve"> from "@/components/</w:t>
+      </w:r>
+      <w:proofErr w:type="spellStart"/>
+      <w:r>
+        <w:t>tt</w:t>
+      </w:r>
+      <w:proofErr w:type="spellEnd"/>
+      <w:r>
+        <w:t>-columns";</w:t>
       </w:r>
     </w:p>
     <w:p>
@@ -812,18 +1507,64 @@
     <w:p/>
     <w:p>
       <w:r>
-        <w:t>The export columns was not found in module [project]/components/tt-columns.tsx [app-client] (ecmascript).</w:t>
-      </w:r>
-    </w:p>
-    <w:p>
-      <w:r>
-        <w:lastRenderedPageBreak/>
-        <w:t>Did you mean to import toSection?</w:t>
-      </w:r>
-    </w:p>
-    <w:p>
-      <w:r>
-        <w:t>All exports of the module are statically known (It doesn't have dynamic exports). So it's known statically that the requested export doesn't exist.</w:t>
+        <w:t xml:space="preserve">The export columns </w:t>
+      </w:r>
+      <w:proofErr w:type="gramStart"/>
+      <w:r>
+        <w:t>was</w:t>
+      </w:r>
+      <w:proofErr w:type="gramEnd"/>
+      <w:r>
+        <w:t xml:space="preserve"> not found in module [project]/components/</w:t>
+      </w:r>
+      <w:proofErr w:type="spellStart"/>
+      <w:r>
+        <w:t>tt-columns.tsx</w:t>
+      </w:r>
+      <w:proofErr w:type="spellEnd"/>
+      <w:r>
+        <w:t xml:space="preserve"> [app-client] (</w:t>
+      </w:r>
+      <w:proofErr w:type="spellStart"/>
+      <w:r>
+        <w:t>ecmascript</w:t>
+      </w:r>
+      <w:proofErr w:type="spellEnd"/>
+      <w:r>
+        <w:t>).</w:t>
+      </w:r>
+    </w:p>
+    <w:p>
+      <w:proofErr w:type="gramStart"/>
+      <w:r>
+        <w:t>Did</w:t>
+      </w:r>
+      <w:proofErr w:type="gramEnd"/>
+      <w:r>
+        <w:t xml:space="preserve"> you mean to import </w:t>
+      </w:r>
+      <w:proofErr w:type="spellStart"/>
+      <w:proofErr w:type="gramStart"/>
+      <w:r>
+        <w:t>toSection</w:t>
+      </w:r>
+      <w:proofErr w:type="spellEnd"/>
+      <w:proofErr w:type="gramEnd"/>
+      <w:r>
+        <w:t>?</w:t>
+      </w:r>
+    </w:p>
+    <w:p>
+      <w:r>
+        <w:t xml:space="preserve">All exports of the module are statically known (It doesn't have dynamic exports). </w:t>
+      </w:r>
+      <w:proofErr w:type="gramStart"/>
+      <w:r>
+        <w:t>So</w:t>
+      </w:r>
+      <w:proofErr w:type="gramEnd"/>
+      <w:r>
+        <w:t xml:space="preserve"> it's known statically that the requested export doesn't exist.</w:t>
       </w:r>
     </w:p>
     <w:p/>
@@ -839,12 +1580,28 @@
     </w:p>
     <w:p>
       <w:r>
-        <w:t xml:space="preserve">    ./app/dashboard/trouble-tickets/page.tsx [Client Component Browser]</w:t>
-      </w:r>
-    </w:p>
-    <w:p>
-      <w:r>
-        <w:t xml:space="preserve">    ./app/dashboard/trouble-tickets/page.tsx [Server Component]</w:t>
+        <w:t xml:space="preserve">    ./app/dashboard/trouble-tickets/</w:t>
+      </w:r>
+      <w:proofErr w:type="spellStart"/>
+      <w:r>
+        <w:t>page.tsx</w:t>
+      </w:r>
+      <w:proofErr w:type="spellEnd"/>
+      <w:r>
+        <w:t xml:space="preserve"> [Client Component Browser]</w:t>
+      </w:r>
+    </w:p>
+    <w:p>
+      <w:r>
+        <w:t xml:space="preserve">    ./app/dashboard/trouble-tickets/</w:t>
+      </w:r>
+      <w:proofErr w:type="spellStart"/>
+      <w:r>
+        <w:t>page.tsx</w:t>
+      </w:r>
+      <w:proofErr w:type="spellEnd"/>
+      <w:r>
+        <w:t xml:space="preserve"> [Server Component]</w:t>
       </w:r>
     </w:p>
     <w:p/>
@@ -855,12 +1612,28 @@
     </w:p>
     <w:p>
       <w:r>
-        <w:t xml:space="preserve">    ./app/dashboard/trouble-tickets/page.tsx [Client Component SSR]</w:t>
-      </w:r>
-    </w:p>
-    <w:p>
-      <w:r>
-        <w:t xml:space="preserve">    ./app/dashboard/trouble-tickets/page.tsx [Server Component]</w:t>
+        <w:t xml:space="preserve">    ./app/dashboard/trouble-tickets/</w:t>
+      </w:r>
+      <w:proofErr w:type="spellStart"/>
+      <w:r>
+        <w:t>page.tsx</w:t>
+      </w:r>
+      <w:proofErr w:type="spellEnd"/>
+      <w:r>
+        <w:t xml:space="preserve"> [Client Component SSR]</w:t>
+      </w:r>
+    </w:p>
+    <w:p>
+      <w:r>
+        <w:t xml:space="preserve">    ./app/dashboard/trouble-tickets/</w:t>
+      </w:r>
+      <w:proofErr w:type="spellStart"/>
+      <w:r>
+        <w:t>page.tsx</w:t>
+      </w:r>
+      <w:proofErr w:type="spellEnd"/>
+      <w:r>
+        <w:t xml:space="preserve"> [Server Component]</w:t>
       </w:r>
     </w:p>
     <w:p/>
@@ -878,7 +1651,6 @@
         <w:rPr>
           <w:noProof/>
         </w:rPr>
-        <w:lastRenderedPageBreak/>
         <w:drawing>
           <wp:inline distT="0" distB="0" distL="0" distR="0" wp14:anchorId="171D5A71" wp14:editId="08928F08">
             <wp:extent cx="5943600" cy="4300855"/>
@@ -895,7 +1667,7 @@
                     <pic:cNvPicPr/>
                   </pic:nvPicPr>
                   <pic:blipFill>
-                    <a:blip r:embed="rId11"/>
+                    <a:blip r:embed="rId10"/>
                     <a:stretch>
                       <a:fillRect/>
                     </a:stretch>
@@ -931,7 +1703,6 @@
         <w:rPr>
           <w:noProof/>
         </w:rPr>
-        <w:lastRenderedPageBreak/>
         <w:drawing>
           <wp:inline distT="0" distB="0" distL="0" distR="0" wp14:anchorId="168C98AD" wp14:editId="7E720F62">
             <wp:extent cx="5943600" cy="3248660"/>
@@ -948,7 +1719,7 @@
                     <pic:cNvPicPr/>
                   </pic:nvPicPr>
                   <pic:blipFill>
-                    <a:blip r:embed="rId12"/>
+                    <a:blip r:embed="rId11"/>
                     <a:stretch>
                       <a:fillRect/>
                     </a:stretch>
@@ -972,7 +1743,15 @@
     <w:p/>
     <w:p>
       <w:r>
-        <w:t>After assigned it will be delivered to employees and the</w:t>
+        <w:t xml:space="preserve">After assigned it will be delivered to </w:t>
+      </w:r>
+      <w:proofErr w:type="gramStart"/>
+      <w:r>
+        <w:t>employees</w:t>
+      </w:r>
+      <w:proofErr w:type="gramEnd"/>
+      <w:r>
+        <w:t xml:space="preserve"> and the</w:t>
       </w:r>
       <w:r>
         <w:t xml:space="preserve"> below form is device assigned</w:t>
@@ -1009,7 +1788,7 @@
                     <pic:cNvPicPr/>
                   </pic:nvPicPr>
                   <pic:blipFill>
-                    <a:blip r:embed="rId13"/>
+                    <a:blip r:embed="rId12"/>
                     <a:stretch>
                       <a:fillRect/>
                     </a:stretch>
@@ -1034,7 +1813,6 @@
     <w:p/>
     <w:p>
       <w:r>
-        <w:lastRenderedPageBreak/>
         <w:drawing>
           <wp:inline distT="0" distB="0" distL="0" distR="0" wp14:anchorId="62CF84F9" wp14:editId="4F8FA6F8">
             <wp:extent cx="5943600" cy="3184525"/>
@@ -1051,7 +1829,7 @@
                     <pic:cNvPicPr/>
                   </pic:nvPicPr>
                   <pic:blipFill>
-                    <a:blip r:embed="rId14"/>
+                    <a:blip r:embed="rId13"/>
                     <a:stretch>
                       <a:fillRect/>
                     </a:stretch>
@@ -1073,6 +1851,93 @@
       </w:r>
     </w:p>
     <w:p/>
+    <w:p/>
+    <w:p/>
+    <w:p>
+      <w:r>
+        <w:t xml:space="preserve">need to set Create button inside Urgent Tasks and if </w:t>
+      </w:r>
+      <w:proofErr w:type="spellStart"/>
+      <w:r>
+        <w:t>ugent</w:t>
+      </w:r>
+      <w:proofErr w:type="spellEnd"/>
+      <w:r>
+        <w:t xml:space="preserve"> task more than 3It will be show 3+ and same will be department and TT Creators Today from IT and Only showing IT Personnel List if more than </w:t>
+      </w:r>
+      <w:proofErr w:type="gramStart"/>
+      <w:r>
+        <w:t>3 .</w:t>
+      </w:r>
+      <w:proofErr w:type="gramEnd"/>
+      <w:r>
+        <w:t xml:space="preserve"> </w:t>
+      </w:r>
+      <w:proofErr w:type="gramStart"/>
+      <w:r>
+        <w:t>it</w:t>
+      </w:r>
+      <w:proofErr w:type="gramEnd"/>
+      <w:r>
+        <w:t xml:space="preserve"> </w:t>
+      </w:r>
+      <w:proofErr w:type="spellStart"/>
+      <w:r>
+        <w:t>wil</w:t>
+      </w:r>
+      <w:proofErr w:type="spellEnd"/>
+      <w:r>
+        <w:t xml:space="preserve"> </w:t>
+      </w:r>
+      <w:proofErr w:type="spellStart"/>
+      <w:r>
+        <w:t>lbe</w:t>
+      </w:r>
+      <w:proofErr w:type="spellEnd"/>
+      <w:r>
+        <w:t xml:space="preserve"> show 3 + and others department will be not showed and after assigning, assigning person will get a notification.</w:t>
+      </w:r>
+    </w:p>
+    <w:p/>
+    <w:p>
+      <w:r>
+        <w:drawing>
+          <wp:inline distT="0" distB="0" distL="0" distR="0" wp14:anchorId="0F2AD9C6" wp14:editId="79F143B0">
+            <wp:extent cx="2171888" cy="1234547"/>
+            <wp:effectExtent l="0" t="0" r="0" b="3810"/>
+            <wp:docPr id="1437589345" name="Picture 1"/>
+            <wp:cNvGraphicFramePr>
+              <a:graphicFrameLocks xmlns:a="http://schemas.openxmlformats.org/drawingml/2006/main" noChangeAspect="1"/>
+            </wp:cNvGraphicFramePr>
+            <a:graphic xmlns:a="http://schemas.openxmlformats.org/drawingml/2006/main">
+              <a:graphicData uri="http://schemas.openxmlformats.org/drawingml/2006/picture">
+                <pic:pic xmlns:pic="http://schemas.openxmlformats.org/drawingml/2006/picture">
+                  <pic:nvPicPr>
+                    <pic:cNvPr id="1437589345" name=""/>
+                    <pic:cNvPicPr/>
+                  </pic:nvPicPr>
+                  <pic:blipFill>
+                    <a:blip r:embed="rId14"/>
+                    <a:stretch>
+                      <a:fillRect/>
+                    </a:stretch>
+                  </pic:blipFill>
+                  <pic:spPr>
+                    <a:xfrm>
+                      <a:off x="0" y="0"/>
+                      <a:ext cx="2171888" cy="1234547"/>
+                    </a:xfrm>
+                    <a:prstGeom prst="rect">
+                      <a:avLst/>
+                    </a:prstGeom>
+                  </pic:spPr>
+                </pic:pic>
+              </a:graphicData>
+            </a:graphic>
+          </wp:inline>
+        </w:drawing>
+      </w:r>
+    </w:p>
     <w:p/>
     <w:p/>
     <w:p/>
@@ -1692,7 +2557,6 @@
   <w:style w:type="character" w:default="1" w:styleId="DefaultParagraphFont">
     <w:name w:val="Default Paragraph Font"/>
     <w:uiPriority w:val="1"/>
-    <w:semiHidden/>
     <w:unhideWhenUsed/>
   </w:style>
   <w:style w:type="table" w:default="1" w:styleId="TableNormal">

</xml_diff>

<commit_message>
To Sent Notification to  Assigned IT Personnel
</commit_message>
<xml_diff>
--- a/document/closed_tt.docx
+++ b/document/closed_tt.docx
@@ -3,57 +3,108 @@
 <w:document xmlns:wpc="http://schemas.microsoft.com/office/word/2010/wordprocessingCanvas" xmlns:cx="http://schemas.microsoft.com/office/drawing/2014/chartex" xmlns:cx1="http://schemas.microsoft.com/office/drawing/2015/9/8/chartex" xmlns:cx2="http://schemas.microsoft.com/office/drawing/2015/10/21/chartex" xmlns:cx3="http://schemas.microsoft.com/office/drawing/2016/5/9/chartex" xmlns:cx4="http://schemas.microsoft.com/office/drawing/2016/5/10/chartex" xmlns:cx5="http://schemas.microsoft.com/office/drawing/2016/5/11/chartex" xmlns:cx6="http://schemas.microsoft.com/office/drawing/2016/5/12/chartex" xmlns:cx7="http://schemas.microsoft.com/office/drawing/2016/5/13/chartex" xmlns:cx8="http://schemas.microsoft.com/office/drawing/2016/5/14/chartex" xmlns:mc="http://schemas.openxmlformats.org/markup-compatibility/2006" xmlns:aink="http://schemas.microsoft.com/office/drawing/2016/ink" xmlns:am3d="http://schemas.microsoft.com/office/drawing/2017/model3d" xmlns:o="urn:schemas-microsoft-com:office:office" xmlns:oel="http://schemas.microsoft.com/office/2019/extlst" xmlns:r="http://schemas.openxmlformats.org/officeDocument/2006/relationships" xmlns:m="http://schemas.openxmlformats.org/officeDocument/2006/math" xmlns:v="urn:schemas-microsoft-com:vml" xmlns:wp14="http://schemas.microsoft.com/office/word/2010/wordprocessingDrawing" xmlns:wp="http://schemas.openxmlformats.org/drawingml/2006/wordprocessingDrawing" xmlns:w10="urn:schemas-microsoft-com:office:word" xmlns:w="http://schemas.openxmlformats.org/wordprocessingml/2006/main" xmlns:w14="http://schemas.microsoft.com/office/word/2010/wordml" xmlns:w15="http://schemas.microsoft.com/office/word/2012/wordml" xmlns:w16cex="http://schemas.microsoft.com/office/word/2018/wordml/cex" xmlns:w16cid="http://schemas.microsoft.com/office/word/2016/wordml/cid" xmlns:w16="http://schemas.microsoft.com/office/word/2018/wordml" xmlns:w16du="http://schemas.microsoft.com/office/word/2023/wordml/word16du" xmlns:w16sdtdh="http://schemas.microsoft.com/office/word/2020/wordml/sdtdatahash" xmlns:w16sdtfl="http://schemas.microsoft.com/office/word/2024/wordml/sdtformatlock" xmlns:w16se="http://schemas.microsoft.com/office/word/2015/wordml/symex" xmlns:wpg="http://schemas.microsoft.com/office/word/2010/wordprocessingGroup" xmlns:wpi="http://schemas.microsoft.com/office/word/2010/wordprocessingInk" xmlns:wne="http://schemas.microsoft.com/office/word/2006/wordml" xmlns:wps="http://schemas.microsoft.com/office/word/2010/wordprocessingShape" mc:Ignorable="w14 w15 w16se w16cid w16 w16cex w16sdtdh w16sdtfl w16du wp14">
   <w:body>
     <w:p>
-      <w:r>
-        <w:fldChar w:fldCharType="begin"/>
-      </w:r>
-      <w:r>
-        <w:instrText>HYPERLINK "https://chatgpt.com/c/6aa2469a-b218-83ee-a063-cf066ce977cc"</w:instrText>
-      </w:r>
-      <w:r>
-        <w:fldChar w:fldCharType="separate"/>
-      </w:r>
-      <w:r>
+      <w:hyperlink r:id="rId4" w:history="1">
+        <w:r>
+          <w:rPr>
+            <w:rStyle w:val="Hyperlink"/>
+          </w:rPr>
+          <w:t>https://chatgpt.com/c/6aa2469a-b218-83ee-a063-cf066ce977cc</w:t>
+        </w:r>
+      </w:hyperlink>
+    </w:p>
+    <w:p/>
+    <w:p>
+      <w:r>
+        <w:t>date : September 10, 2026</w:t>
+      </w:r>
+    </w:p>
+    <w:p>
+      <w:r>
+        <w:t>Itm.root</w:t>
+      </w:r>
+    </w:p>
+    <w:p>
+      <w:r>
+        <w:t>f@hrt1@itm_new</w:t>
+      </w:r>
+    </w:p>
+    <w:p/>
+    <w:p>
+      <w:r>
+        <w:t>'247', 'kazi.salauddin', 'kazi.salauddin', '02-0009', 'kazi.salauddin@fiberathome.net', '01199577617', '3', 'Kazi Salauddin', 'Board Secretariat and Company Affairs', 'Board Secretariat and Company Affairs', 'Company Secretary', '1', NULL, '2009-02-01 00:00:00', 'Kazi Salauddin', '2016-01-06 12:50:54', 'shakil.khan', 'Yes', '247', NULL, NULL, NULL, NULL, NULL, NULL</w:t>
+      </w:r>
+    </w:p>
+    <w:p/>
+    <w:p>
+      <w:pPr>
+        <w:spacing w:after="0" w:line="240" w:lineRule="auto"/>
         <w:rPr>
-          <w:rStyle w:val="Hyperlink"/>
+          <w:rFonts w:ascii="Times New Roman" w:eastAsia="Times New Roman" w:hAnsi="Times New Roman" w:cs="Times New Roman"/>
+          <w:kern w:val="0"/>
+          <w14:ligatures w14:val="none"/>
         </w:rPr>
-        <w:t>https://chatgpt.com/c/6aa2469a-b218-83ee-a063-cf066ce977cc</w:t>
-      </w:r>
-      <w:r>
-        <w:fldChar w:fldCharType="end"/>
-      </w:r>
-    </w:p>
-    <w:p/>
-    <w:p>
-      <w:proofErr w:type="gramStart"/>
-      <w:r>
-        <w:t>date :</w:t>
-      </w:r>
-      <w:proofErr w:type="gramEnd"/>
-      <w:r>
-        <w:t xml:space="preserve"> September 10, 2026</w:t>
-      </w:r>
-    </w:p>
-    <w:p>
-      <w:proofErr w:type="spellStart"/>
-      <w:r>
-        <w:t>Itm.root</w:t>
-      </w:r>
-      <w:proofErr w:type="spellEnd"/>
-    </w:p>
-    <w:p>
-      <w:r>
-        <w:t>f@hrt1@itm_new</w:t>
-      </w:r>
-    </w:p>
-    <w:p/>
-    <w:p>
-      <w:proofErr w:type="spellStart"/>
-      <w:proofErr w:type="gramStart"/>
+      </w:pPr>
+      <w:r>
+        <w:rPr>
+          <w:rFonts w:ascii="Times New Roman" w:eastAsia="Times New Roman" w:hAnsi="Times New Roman" w:cs="Times New Roman"/>
+          <w:kern w:val="0"/>
+          <w14:ligatures w14:val="none"/>
+        </w:rPr>
+        <w:t>rafiqur.rahman</w:t>
+      </w:r>
+    </w:p>
+    <w:p>
+      <w:pPr>
+        <w:spacing w:after="0" w:line="240" w:lineRule="auto"/>
+        <w:rPr>
+          <w:rFonts w:ascii="Times New Roman" w:eastAsia="Times New Roman" w:hAnsi="Times New Roman" w:cs="Times New Roman"/>
+          <w:kern w:val="0"/>
+          <w14:ligatures w14:val="none"/>
+        </w:rPr>
+      </w:pPr>
+      <w:r>
+        <w:rPr>
+          <w:rFonts w:ascii="Times New Roman" w:eastAsia="Times New Roman" w:hAnsi="Times New Roman" w:cs="Times New Roman"/>
+          <w:kern w:val="0"/>
+          <w14:ligatures w14:val="none"/>
+        </w:rPr>
+        <w:t>rafiqur.rahman</w:t>
+      </w:r>
+    </w:p>
+    <w:p>
+      <w:pPr>
+        <w:spacing w:after="0" w:line="240" w:lineRule="auto"/>
+        <w:rPr>
+          <w:rFonts w:ascii="Times New Roman" w:eastAsia="Times New Roman" w:hAnsi="Times New Roman" w:cs="Times New Roman"/>
+          <w:kern w:val="0"/>
+          <w14:ligatures w14:val="none"/>
+        </w:rPr>
+      </w:pPr>
+    </w:p>
+    <w:p>
+      <w:pPr>
+        <w:spacing w:after="0" w:line="240" w:lineRule="auto"/>
+        <w:rPr>
+          <w:rFonts w:ascii="Times New Roman" w:eastAsia="Times New Roman" w:hAnsi="Times New Roman" w:cs="Times New Roman"/>
+          <w:kern w:val="0"/>
+          <w14:ligatures w14:val="none"/>
+        </w:rPr>
+      </w:pPr>
+      <w:r>
+        <w:rPr>
+          <w:rFonts w:ascii="Times New Roman" w:eastAsia="Times New Roman" w:hAnsi="Times New Roman" w:cs="Times New Roman"/>
+          <w:kern w:val="0"/>
+          <w14:ligatures w14:val="none"/>
+        </w:rPr>
+        <w:t>02-0003'</w:t>
+      </w:r>
+    </w:p>
+    <w:p/>
+    <w:p/>
+    <w:p>
       <w:r>
         <w:t>saulad.alvi</w:t>
       </w:r>
-      <w:proofErr w:type="spellEnd"/>
-      <w:proofErr w:type="gramEnd"/>
     </w:p>
     <w:p>
       <w:r>
@@ -89,11 +140,9 @@
       </w:pPr>
     </w:p>
     <w:p>
-      <w:proofErr w:type="spellStart"/>
       <w:r>
         <w:t>smariful</w:t>
       </w:r>
-      <w:proofErr w:type="spellEnd"/>
     </w:p>
     <w:p>
       <w:r>
@@ -111,13 +160,10 @@
       </w:r>
     </w:p>
     <w:p>
-      <w:proofErr w:type="spellStart"/>
-      <w:proofErr w:type="gramStart"/>
-      <w:r>
+      <w:r>
+        <w:lastRenderedPageBreak/>
         <w:t>shakil.khan</w:t>
       </w:r>
-      <w:proofErr w:type="spellEnd"/>
-      <w:proofErr w:type="gramEnd"/>
     </w:p>
     <w:p>
       <w:r>
@@ -133,13 +179,9 @@
     </w:p>
     <w:p/>
     <w:p>
-      <w:proofErr w:type="spellStart"/>
-      <w:proofErr w:type="gramStart"/>
       <w:r>
         <w:t>nur.hosen</w:t>
       </w:r>
-      <w:proofErr w:type="spellEnd"/>
-      <w:proofErr w:type="gramEnd"/>
     </w:p>
     <w:p>
       <w:r>
@@ -155,14 +197,9 @@
     </w:p>
     <w:p/>
     <w:p>
-      <w:proofErr w:type="spellStart"/>
-      <w:proofErr w:type="gramStart"/>
-      <w:r>
-        <w:lastRenderedPageBreak/>
+      <w:r>
         <w:t>limon.miah</w:t>
       </w:r>
-      <w:proofErr w:type="spellEnd"/>
-      <w:proofErr w:type="gramEnd"/>
     </w:p>
     <w:p>
       <w:r>
@@ -171,7 +208,7 @@
     </w:p>
     <w:p/>
     <w:p>
-      <w:hyperlink r:id="rId4" w:history="1">
+      <w:hyperlink r:id="rId5" w:history="1">
         <w:r>
           <w:rPr>
             <w:rStyle w:val="Hyperlink"/>
@@ -182,15 +219,9 @@
     </w:p>
     <w:p/>
     <w:p>
-      <w:proofErr w:type="gramStart"/>
-      <w:r>
-        <w:t>Date :</w:t>
-      </w:r>
-      <w:proofErr w:type="gramEnd"/>
-      <w:r>
-        <w:t xml:space="preserve"> 10</w:t>
-      </w:r>
-      <w:proofErr w:type="gramStart"/>
+      <w:r>
+        <w:t>Date : 10</w:t>
+      </w:r>
       <w:r>
         <w:rPr>
           <w:vertAlign w:val="superscript"/>
@@ -201,25 +232,13 @@
         <w:t xml:space="preserve"> </w:t>
       </w:r>
       <w:r>
-        <w:t xml:space="preserve"> September</w:t>
-      </w:r>
-      <w:proofErr w:type="gramEnd"/>
-      <w:r>
-        <w:t>, 2026</w:t>
-      </w:r>
-    </w:p>
-    <w:p/>
-    <w:p>
-      <w:r>
-        <w:t xml:space="preserve">select * from </w:t>
-      </w:r>
-      <w:proofErr w:type="spellStart"/>
-      <w:r>
-        <w:t>inventory_categories</w:t>
-      </w:r>
-      <w:proofErr w:type="spellEnd"/>
-      <w:r>
-        <w:t xml:space="preserve"> order by id desc</w:t>
+        <w:t xml:space="preserve"> September, 2026</w:t>
+      </w:r>
+    </w:p>
+    <w:p/>
+    <w:p>
+      <w:r>
+        <w:t>select * from inventory_categories order by id desc</w:t>
       </w:r>
     </w:p>
     <w:p/>
@@ -236,46 +255,8 @@
           <w:iCs/>
           <w:color w:val="EE0000"/>
         </w:rPr>
-        <w:t xml:space="preserve">These two </w:t>
-      </w:r>
-      <w:proofErr w:type="gramStart"/>
-      <w:r>
-        <w:rPr>
-          <w:i/>
-          <w:iCs/>
-          <w:color w:val="EE0000"/>
-        </w:rPr>
-        <w:t xml:space="preserve">files  </w:t>
-      </w:r>
-      <w:proofErr w:type="spellStart"/>
-      <w:r>
-        <w:rPr>
-          <w:i/>
-          <w:iCs/>
-          <w:color w:val="EE0000"/>
-        </w:rPr>
-        <w:t>itm</w:t>
-      </w:r>
-      <w:proofErr w:type="spellEnd"/>
-      <w:r>
-        <w:rPr>
-          <w:i/>
-          <w:iCs/>
-          <w:color w:val="EE0000"/>
-        </w:rPr>
-        <w:t>/frontend/components/</w:t>
-      </w:r>
-      <w:proofErr w:type="spellStart"/>
-      <w:r>
-        <w:rPr>
-          <w:i/>
-          <w:iCs/>
-          <w:color w:val="EE0000"/>
-        </w:rPr>
-        <w:t>tt-columns.tsx</w:t>
-      </w:r>
-      <w:proofErr w:type="spellEnd"/>
-      <w:proofErr w:type="gramEnd"/>
+        <w:t>These two files  itm/frontend/components/tt-columns.tsx</w:t>
+      </w:r>
     </w:p>
     <w:p>
       <w:pPr>
@@ -291,110 +272,14 @@
           <w:iCs/>
           <w:color w:val="EE0000"/>
         </w:rPr>
-        <w:t>frontend/components/</w:t>
-      </w:r>
-      <w:proofErr w:type="spellStart"/>
-      <w:r>
-        <w:rPr>
-          <w:i/>
-          <w:iCs/>
-          <w:color w:val="EE0000"/>
-        </w:rPr>
-        <w:t>TTTable.tsx</w:t>
-      </w:r>
-      <w:proofErr w:type="spellEnd"/>
-      <w:r>
-        <w:rPr>
-          <w:i/>
-          <w:iCs/>
-          <w:color w:val="EE0000"/>
-        </w:rPr>
-        <w:t xml:space="preserve"> are involved in </w:t>
-      </w:r>
-      <w:proofErr w:type="spellStart"/>
-      <w:r>
-        <w:rPr>
-          <w:i/>
-          <w:iCs/>
-          <w:color w:val="EE0000"/>
-        </w:rPr>
-        <w:t>itm</w:t>
-      </w:r>
-      <w:proofErr w:type="spellEnd"/>
-      <w:r>
-        <w:rPr>
-          <w:i/>
-          <w:iCs/>
-          <w:color w:val="EE0000"/>
-        </w:rPr>
-        <w:t>/backend/internal/handler/</w:t>
-      </w:r>
-      <w:proofErr w:type="spellStart"/>
-      <w:proofErr w:type="gramStart"/>
-      <w:r>
-        <w:rPr>
-          <w:i/>
-          <w:iCs/>
-          <w:color w:val="EE0000"/>
-        </w:rPr>
-        <w:t>handlers.go</w:t>
-      </w:r>
-      <w:proofErr w:type="spellEnd"/>
-      <w:proofErr w:type="gramEnd"/>
-    </w:p>
-    <w:p/>
-    <w:p/>
-    <w:p>
-      <w:r>
-        <w:t xml:space="preserve">select id, </w:t>
-      </w:r>
-      <w:proofErr w:type="spellStart"/>
-      <w:r>
-        <w:t>employee_id</w:t>
-      </w:r>
-      <w:proofErr w:type="spellEnd"/>
-      <w:r>
-        <w:t xml:space="preserve">, status, </w:t>
-      </w:r>
-      <w:proofErr w:type="spellStart"/>
-      <w:r>
-        <w:t>created_at</w:t>
-      </w:r>
-      <w:proofErr w:type="spellEnd"/>
-      <w:r>
-        <w:t xml:space="preserve">, </w:t>
-      </w:r>
-      <w:proofErr w:type="spellStart"/>
-      <w:r>
-        <w:t>closed_at</w:t>
-      </w:r>
-      <w:proofErr w:type="spellEnd"/>
-      <w:r>
-        <w:t xml:space="preserve">, </w:t>
-      </w:r>
-      <w:proofErr w:type="spellStart"/>
-      <w:r>
-        <w:t>closed_by</w:t>
-      </w:r>
-      <w:proofErr w:type="spellEnd"/>
-      <w:r>
-        <w:t xml:space="preserve">, </w:t>
-      </w:r>
-      <w:proofErr w:type="spellStart"/>
-      <w:r>
-        <w:t>closing_description</w:t>
-      </w:r>
-      <w:proofErr w:type="spellEnd"/>
-      <w:r>
-        <w:t xml:space="preserve"> from   </w:t>
-      </w:r>
-      <w:proofErr w:type="spellStart"/>
-      <w:r>
-        <w:t>trouble_tickets</w:t>
-      </w:r>
-      <w:proofErr w:type="spellEnd"/>
-      <w:r>
-        <w:t xml:space="preserve"> where id ='29578'</w:t>
+        <w:t>frontend/components/TTTable.tsx are involved in itm/backend/internal/handler/handlers.go</w:t>
+      </w:r>
+    </w:p>
+    <w:p/>
+    <w:p/>
+    <w:p>
+      <w:r>
+        <w:t>select id, employee_id, status, created_at, closed_at, closed_by, closing_description from   trouble_tickets where id ='29578'</w:t>
       </w:r>
     </w:p>
     <w:p/>
@@ -420,7 +305,7 @@
                     <pic:cNvPicPr/>
                   </pic:nvPicPr>
                   <pic:blipFill>
-                    <a:blip r:embed="rId5"/>
+                    <a:blip r:embed="rId6"/>
                     <a:stretch>
                       <a:fillRect/>
                     </a:stretch>
@@ -445,99 +330,20 @@
     <w:p/>
     <w:p>
       <w:r>
-        <w:t xml:space="preserve">Yes, you can run this in </w:t>
-      </w:r>
-      <w:proofErr w:type="spellStart"/>
-      <w:r>
-        <w:t>pgAdmin</w:t>
-      </w:r>
-      <w:proofErr w:type="spellEnd"/>
-      <w:r>
-        <w:t>, but first confirm the actual table and column names match exactly:</w:t>
-      </w:r>
-    </w:p>
-    <w:p>
-      <w:proofErr w:type="spellStart"/>
-      <w:proofErr w:type="gramStart"/>
-      <w:r>
-        <w:t>public.auth</w:t>
-      </w:r>
-      <w:proofErr w:type="gramEnd"/>
-      <w:r>
-        <w:t>_</w:t>
-      </w:r>
-      <w:proofErr w:type="gramStart"/>
-      <w:r>
-        <w:t>permissions</w:t>
-      </w:r>
-      <w:proofErr w:type="spellEnd"/>
-      <w:r>
-        <w:t>(</w:t>
-      </w:r>
-      <w:proofErr w:type="gramEnd"/>
-      <w:r>
-        <w:t>code, name, active)</w:t>
+        <w:t>Yes, you can run this in pgAdmin, but first confirm the actual table and column names match exactly:</w:t>
+      </w:r>
+    </w:p>
+    <w:p>
+      <w:r>
+        <w:t>public.auth_permissions(code, name, active)</w:t>
       </w:r>
       <w:r>
         <w:br/>
-      </w:r>
-      <w:proofErr w:type="spellStart"/>
-      <w:proofErr w:type="gramStart"/>
-      <w:r>
-        <w:t>public.auth</w:t>
-      </w:r>
-      <w:proofErr w:type="gramEnd"/>
-      <w:r>
-        <w:t>_role_</w:t>
-      </w:r>
-      <w:proofErr w:type="gramStart"/>
-      <w:r>
-        <w:t>permissions</w:t>
-      </w:r>
-      <w:proofErr w:type="spellEnd"/>
-      <w:r>
-        <w:t>(</w:t>
-      </w:r>
-      <w:proofErr w:type="spellStart"/>
-      <w:proofErr w:type="gramEnd"/>
-      <w:r>
-        <w:t>role_id</w:t>
-      </w:r>
-      <w:proofErr w:type="spellEnd"/>
-      <w:r>
-        <w:t xml:space="preserve">, </w:t>
-      </w:r>
-      <w:proofErr w:type="spellStart"/>
-      <w:r>
-        <w:t>permission_id</w:t>
-      </w:r>
-      <w:proofErr w:type="spellEnd"/>
-      <w:r>
-        <w:t>)</w:t>
+        <w:t>public.auth_role_permissions(role_id, permission_id)</w:t>
       </w:r>
       <w:r>
         <w:br/>
-      </w:r>
-      <w:proofErr w:type="spellStart"/>
-      <w:proofErr w:type="gramStart"/>
-      <w:r>
-        <w:t>public.auth</w:t>
-      </w:r>
-      <w:proofErr w:type="gramEnd"/>
-      <w:r>
-        <w:t>_</w:t>
-      </w:r>
-      <w:proofErr w:type="gramStart"/>
-      <w:r>
-        <w:t>roles</w:t>
-      </w:r>
-      <w:proofErr w:type="spellEnd"/>
-      <w:r>
-        <w:t>(</w:t>
-      </w:r>
-      <w:proofErr w:type="gramEnd"/>
-      <w:r>
-        <w:t>id, code, name, active)</w:t>
+        <w:t>public.auth_roles(id, code, name, active)</w:t>
       </w:r>
     </w:p>
     <w:p>
@@ -554,20 +360,7 @@
     <w:p/>
     <w:p>
       <w:r>
-        <w:t xml:space="preserve">INSERT INTO </w:t>
-      </w:r>
-      <w:proofErr w:type="spellStart"/>
-      <w:proofErr w:type="gramStart"/>
-      <w:r>
-        <w:t>public.auth</w:t>
-      </w:r>
-      <w:proofErr w:type="gramEnd"/>
-      <w:r>
-        <w:t>_permissions</w:t>
-      </w:r>
-      <w:proofErr w:type="spellEnd"/>
-      <w:r>
-        <w:t xml:space="preserve"> (</w:t>
+        <w:t>INSERT INTO public.auth_permissions (</w:t>
       </w:r>
     </w:p>
     <w:p>
@@ -598,15 +391,7 @@
     </w:p>
     <w:p>
       <w:r>
-        <w:t xml:space="preserve">    '</w:t>
-      </w:r>
-      <w:proofErr w:type="spellStart"/>
-      <w:r>
-        <w:t>TT_Close</w:t>
-      </w:r>
-      <w:proofErr w:type="spellEnd"/>
-      <w:r>
-        <w:t>',</w:t>
+        <w:t xml:space="preserve">    'TT_Close',</w:t>
       </w:r>
     </w:p>
     <w:p>
@@ -647,44 +432,18 @@
     <w:p/>
     <w:p>
       <w:r>
-        <w:t xml:space="preserve">INSERT INTO </w:t>
-      </w:r>
-      <w:proofErr w:type="spellStart"/>
-      <w:proofErr w:type="gramStart"/>
-      <w:r>
-        <w:t>public.auth</w:t>
-      </w:r>
-      <w:proofErr w:type="gramEnd"/>
-      <w:r>
-        <w:t>_role_permissions</w:t>
-      </w:r>
-      <w:proofErr w:type="spellEnd"/>
-      <w:r>
-        <w:t xml:space="preserve"> (</w:t>
-      </w:r>
-    </w:p>
-    <w:p>
-      <w:r>
-        <w:t xml:space="preserve">    </w:t>
-      </w:r>
-      <w:proofErr w:type="spellStart"/>
-      <w:r>
-        <w:t>role_id</w:t>
-      </w:r>
-      <w:proofErr w:type="spellEnd"/>
-      <w:r>
-        <w:t>,</w:t>
-      </w:r>
-    </w:p>
-    <w:p>
-      <w:r>
-        <w:t xml:space="preserve">    </w:t>
-      </w:r>
-      <w:proofErr w:type="spellStart"/>
-      <w:r>
-        <w:t>permission_id</w:t>
-      </w:r>
-      <w:proofErr w:type="spellEnd"/>
+        <w:t>INSERT INTO public.auth_role_permissions (</w:t>
+      </w:r>
+    </w:p>
+    <w:p>
+      <w:r>
+        <w:t xml:space="preserve">    role_id,</w:t>
+      </w:r>
+    </w:p>
+    <w:p>
+      <w:r>
+        <w:t xml:space="preserve">    permission_id</w:t>
+      </w:r>
     </w:p>
     <w:p>
       <w:r>
@@ -708,53 +467,17 @@
     </w:p>
     <w:p>
       <w:r>
-        <w:t xml:space="preserve">FROM </w:t>
-      </w:r>
-      <w:proofErr w:type="spellStart"/>
-      <w:proofErr w:type="gramStart"/>
-      <w:r>
-        <w:t>public.auth</w:t>
-      </w:r>
-      <w:proofErr w:type="gramEnd"/>
-      <w:r>
-        <w:t>_roles</w:t>
-      </w:r>
-      <w:proofErr w:type="spellEnd"/>
-      <w:r>
-        <w:t xml:space="preserve"> AS r</w:t>
-      </w:r>
-    </w:p>
-    <w:p>
-      <w:r>
-        <w:t xml:space="preserve">CROSS JOIN </w:t>
-      </w:r>
-      <w:proofErr w:type="spellStart"/>
-      <w:proofErr w:type="gramStart"/>
-      <w:r>
-        <w:t>public.auth</w:t>
-      </w:r>
-      <w:proofErr w:type="gramEnd"/>
-      <w:r>
-        <w:t>_permissions</w:t>
-      </w:r>
-      <w:proofErr w:type="spellEnd"/>
-      <w:r>
-        <w:t xml:space="preserve"> AS p</w:t>
-      </w:r>
-    </w:p>
-    <w:p>
-      <w:r>
-        <w:t xml:space="preserve">WHERE </w:t>
-      </w:r>
-      <w:proofErr w:type="spellStart"/>
-      <w:proofErr w:type="gramStart"/>
-      <w:r>
-        <w:t>r.code</w:t>
-      </w:r>
-      <w:proofErr w:type="spellEnd"/>
-      <w:proofErr w:type="gramEnd"/>
-      <w:r>
-        <w:t xml:space="preserve"> IN (</w:t>
+        <w:t>FROM public.auth_roles AS r</w:t>
+      </w:r>
+    </w:p>
+    <w:p>
+      <w:r>
+        <w:t>CROSS JOIN public.auth_permissions AS p</w:t>
+      </w:r>
+    </w:p>
+    <w:p>
+      <w:r>
+        <w:t>WHERE r.code IN (</w:t>
       </w:r>
     </w:p>
     <w:p>
@@ -779,56 +502,18 @@
     </w:p>
     <w:p>
       <w:r>
-        <w:t xml:space="preserve">  AND </w:t>
-      </w:r>
-      <w:proofErr w:type="spellStart"/>
-      <w:proofErr w:type="gramStart"/>
-      <w:r>
-        <w:t>r.active</w:t>
-      </w:r>
-      <w:proofErr w:type="spellEnd"/>
-      <w:proofErr w:type="gramEnd"/>
-      <w:r>
-        <w:t xml:space="preserve"> = TRUE</w:t>
-      </w:r>
-    </w:p>
-    <w:p>
-      <w:r>
-        <w:t xml:space="preserve">  AND </w:t>
-      </w:r>
-      <w:proofErr w:type="spellStart"/>
-      <w:proofErr w:type="gramStart"/>
-      <w:r>
-        <w:t>p.code</w:t>
-      </w:r>
-      <w:proofErr w:type="spellEnd"/>
-      <w:proofErr w:type="gramEnd"/>
-      <w:r>
-        <w:t xml:space="preserve"> = '</w:t>
-      </w:r>
-      <w:proofErr w:type="spellStart"/>
-      <w:r>
-        <w:t>TT_Close</w:t>
-      </w:r>
-      <w:proofErr w:type="spellEnd"/>
-      <w:r>
-        <w:t>'</w:t>
+        <w:t xml:space="preserve">  AND r.active = TRUE</w:t>
+      </w:r>
+    </w:p>
+    <w:p>
+      <w:r>
+        <w:t xml:space="preserve">  AND p.code = 'TT_Close'</w:t>
       </w:r>
     </w:p>
     <w:p>
       <w:r>
         <w:lastRenderedPageBreak/>
-        <w:t xml:space="preserve">  AND </w:t>
-      </w:r>
-      <w:proofErr w:type="spellStart"/>
-      <w:proofErr w:type="gramStart"/>
-      <w:r>
-        <w:t>p.active</w:t>
-      </w:r>
-      <w:proofErr w:type="spellEnd"/>
-      <w:proofErr w:type="gramEnd"/>
-      <w:r>
-        <w:t xml:space="preserve"> = TRUE</w:t>
+        <w:t xml:space="preserve">  AND p.active = TRUE</w:t>
       </w:r>
     </w:p>
     <w:p>
@@ -844,148 +529,42 @@
     </w:p>
     <w:p>
       <w:r>
-        <w:t xml:space="preserve">-- GENERAL_USER must not have </w:t>
-      </w:r>
-      <w:proofErr w:type="spellStart"/>
-      <w:r>
-        <w:t>TT_Close</w:t>
-      </w:r>
-      <w:proofErr w:type="spellEnd"/>
-      <w:r>
-        <w:t xml:space="preserve"> directly.</w:t>
-      </w:r>
-    </w:p>
-    <w:p>
-      <w:r>
-        <w:t xml:space="preserve">DELETE FROM </w:t>
-      </w:r>
-      <w:proofErr w:type="spellStart"/>
-      <w:proofErr w:type="gramStart"/>
-      <w:r>
-        <w:t>public.auth</w:t>
-      </w:r>
-      <w:proofErr w:type="gramEnd"/>
-      <w:r>
-        <w:t>_role_permissions</w:t>
-      </w:r>
-      <w:proofErr w:type="spellEnd"/>
-      <w:r>
-        <w:t xml:space="preserve"> AS </w:t>
-      </w:r>
-      <w:proofErr w:type="spellStart"/>
-      <w:r>
-        <w:t>rp</w:t>
-      </w:r>
-      <w:proofErr w:type="spellEnd"/>
-    </w:p>
-    <w:p>
-      <w:r>
-        <w:t xml:space="preserve">USING </w:t>
-      </w:r>
-      <w:proofErr w:type="spellStart"/>
-      <w:proofErr w:type="gramStart"/>
-      <w:r>
-        <w:t>public.auth</w:t>
-      </w:r>
-      <w:proofErr w:type="gramEnd"/>
-      <w:r>
-        <w:t>_roles</w:t>
-      </w:r>
-      <w:proofErr w:type="spellEnd"/>
-      <w:r>
-        <w:t xml:space="preserve"> AS r,</w:t>
-      </w:r>
-    </w:p>
-    <w:p>
-      <w:r>
-        <w:t xml:space="preserve">      </w:t>
-      </w:r>
-      <w:proofErr w:type="spellStart"/>
-      <w:proofErr w:type="gramStart"/>
-      <w:r>
-        <w:t>public.auth</w:t>
-      </w:r>
-      <w:proofErr w:type="gramEnd"/>
-      <w:r>
-        <w:t>_permissions</w:t>
-      </w:r>
-      <w:proofErr w:type="spellEnd"/>
-      <w:r>
-        <w:t xml:space="preserve"> AS p</w:t>
-      </w:r>
-    </w:p>
-    <w:p>
-      <w:r>
-        <w:t xml:space="preserve">WHERE </w:t>
-      </w:r>
-      <w:proofErr w:type="spellStart"/>
-      <w:proofErr w:type="gramStart"/>
-      <w:r>
-        <w:t>rp.role</w:t>
-      </w:r>
-      <w:proofErr w:type="gramEnd"/>
-      <w:r>
-        <w:t>_id</w:t>
-      </w:r>
-      <w:proofErr w:type="spellEnd"/>
-      <w:r>
-        <w:t xml:space="preserve"> = r.id</w:t>
-      </w:r>
-    </w:p>
-    <w:p>
-      <w:r>
-        <w:t xml:space="preserve">  AND </w:t>
-      </w:r>
-      <w:proofErr w:type="spellStart"/>
-      <w:proofErr w:type="gramStart"/>
-      <w:r>
-        <w:t>rp.permission</w:t>
-      </w:r>
-      <w:proofErr w:type="gramEnd"/>
-      <w:r>
-        <w:t>_id</w:t>
-      </w:r>
-      <w:proofErr w:type="spellEnd"/>
-      <w:r>
-        <w:t xml:space="preserve"> = p.id</w:t>
-      </w:r>
-    </w:p>
-    <w:p>
-      <w:r>
-        <w:t xml:space="preserve">  AND </w:t>
-      </w:r>
-      <w:proofErr w:type="spellStart"/>
-      <w:proofErr w:type="gramStart"/>
-      <w:r>
-        <w:t>r.code</w:t>
-      </w:r>
-      <w:proofErr w:type="spellEnd"/>
-      <w:proofErr w:type="gramEnd"/>
-      <w:r>
-        <w:t xml:space="preserve"> = 'GENERAL_USER'</w:t>
-      </w:r>
-    </w:p>
-    <w:p>
-      <w:r>
-        <w:t xml:space="preserve">  AND </w:t>
-      </w:r>
-      <w:proofErr w:type="spellStart"/>
-      <w:proofErr w:type="gramStart"/>
-      <w:r>
-        <w:t>p.code</w:t>
-      </w:r>
-      <w:proofErr w:type="spellEnd"/>
-      <w:proofErr w:type="gramEnd"/>
-      <w:r>
-        <w:t xml:space="preserve"> = '</w:t>
-      </w:r>
-      <w:proofErr w:type="spellStart"/>
-      <w:r>
-        <w:t>TT_Close</w:t>
-      </w:r>
-      <w:proofErr w:type="spellEnd"/>
-      <w:r>
-        <w:t>';</w:t>
+        <w:t>-- GENERAL_USER must not have TT_Close directly.</w:t>
+      </w:r>
+    </w:p>
+    <w:p>
+      <w:r>
+        <w:t>DELETE FROM public.auth_role_permissions AS rp</w:t>
+      </w:r>
+    </w:p>
+    <w:p>
+      <w:r>
+        <w:t>USING public.auth_roles AS r,</w:t>
+      </w:r>
+    </w:p>
+    <w:p>
+      <w:r>
+        <w:t xml:space="preserve">      public.auth_permissions AS p</w:t>
+      </w:r>
+    </w:p>
+    <w:p>
+      <w:r>
+        <w:t>WHERE rp.role_id = r.id</w:t>
+      </w:r>
+    </w:p>
+    <w:p>
+      <w:r>
+        <w:t xml:space="preserve">  AND rp.permission_id = p.id</w:t>
+      </w:r>
+    </w:p>
+    <w:p>
+      <w:r>
+        <w:t xml:space="preserve">  AND r.code = 'GENERAL_USER'</w:t>
+      </w:r>
+    </w:p>
+    <w:p>
+      <w:r>
+        <w:t xml:space="preserve">  AND p.code = 'TT_Close';</w:t>
       </w:r>
     </w:p>
     <w:p/>
@@ -1007,184 +586,53 @@
     </w:p>
     <w:p>
       <w:r>
-        <w:t xml:space="preserve">    r.id AS </w:t>
-      </w:r>
-      <w:proofErr w:type="spellStart"/>
-      <w:r>
-        <w:t>role_id</w:t>
-      </w:r>
-      <w:proofErr w:type="spellEnd"/>
-      <w:r>
-        <w:t>,</w:t>
-      </w:r>
-    </w:p>
-    <w:p>
-      <w:r>
-        <w:t xml:space="preserve">    </w:t>
-      </w:r>
-      <w:proofErr w:type="spellStart"/>
-      <w:proofErr w:type="gramStart"/>
-      <w:r>
-        <w:t>r.code</w:t>
-      </w:r>
-      <w:proofErr w:type="spellEnd"/>
-      <w:proofErr w:type="gramEnd"/>
-      <w:r>
-        <w:t xml:space="preserve"> AS </w:t>
-      </w:r>
-      <w:proofErr w:type="spellStart"/>
-      <w:r>
-        <w:t>role_code</w:t>
-      </w:r>
-      <w:proofErr w:type="spellEnd"/>
-      <w:r>
-        <w:t>,</w:t>
-      </w:r>
-    </w:p>
-    <w:p>
-      <w:r>
-        <w:t xml:space="preserve">    r.name AS </w:t>
-      </w:r>
-      <w:proofErr w:type="spellStart"/>
-      <w:r>
-        <w:t>role_name</w:t>
-      </w:r>
-      <w:proofErr w:type="spellEnd"/>
-      <w:r>
-        <w:t>,</w:t>
-      </w:r>
-    </w:p>
-    <w:p>
-      <w:r>
-        <w:t xml:space="preserve">    </w:t>
-      </w:r>
-      <w:proofErr w:type="spellStart"/>
-      <w:proofErr w:type="gramStart"/>
-      <w:r>
-        <w:t>p.code</w:t>
-      </w:r>
-      <w:proofErr w:type="spellEnd"/>
-      <w:proofErr w:type="gramEnd"/>
-      <w:r>
-        <w:t xml:space="preserve"> AS </w:t>
-      </w:r>
-      <w:proofErr w:type="spellStart"/>
-      <w:r>
-        <w:t>permission_code</w:t>
-      </w:r>
-      <w:proofErr w:type="spellEnd"/>
-    </w:p>
-    <w:p>
-      <w:r>
-        <w:t xml:space="preserve">FROM </w:t>
-      </w:r>
-      <w:proofErr w:type="spellStart"/>
-      <w:proofErr w:type="gramStart"/>
-      <w:r>
-        <w:t>public.auth</w:t>
-      </w:r>
-      <w:proofErr w:type="gramEnd"/>
-      <w:r>
-        <w:t>_role_permissions</w:t>
-      </w:r>
-      <w:proofErr w:type="spellEnd"/>
-      <w:r>
-        <w:t xml:space="preserve"> AS </w:t>
-      </w:r>
-      <w:proofErr w:type="spellStart"/>
-      <w:r>
-        <w:t>rp</w:t>
-      </w:r>
-      <w:proofErr w:type="spellEnd"/>
-    </w:p>
-    <w:p>
-      <w:r>
-        <w:t xml:space="preserve">JOIN </w:t>
-      </w:r>
-      <w:proofErr w:type="spellStart"/>
-      <w:proofErr w:type="gramStart"/>
-      <w:r>
-        <w:t>public.auth</w:t>
-      </w:r>
-      <w:proofErr w:type="gramEnd"/>
-      <w:r>
-        <w:t>_roles</w:t>
-      </w:r>
-      <w:proofErr w:type="spellEnd"/>
-      <w:r>
-        <w:t xml:space="preserve"> AS r</w:t>
-      </w:r>
-    </w:p>
-    <w:p>
-      <w:r>
-        <w:t xml:space="preserve">    ON r.id = </w:t>
-      </w:r>
-      <w:proofErr w:type="spellStart"/>
-      <w:proofErr w:type="gramStart"/>
-      <w:r>
-        <w:t>rp.role</w:t>
-      </w:r>
-      <w:proofErr w:type="gramEnd"/>
-      <w:r>
-        <w:t>_id</w:t>
-      </w:r>
-      <w:proofErr w:type="spellEnd"/>
-    </w:p>
-    <w:p>
-      <w:r>
-        <w:t xml:space="preserve">JOIN </w:t>
-      </w:r>
-      <w:proofErr w:type="spellStart"/>
-      <w:proofErr w:type="gramStart"/>
-      <w:r>
-        <w:t>public.auth</w:t>
-      </w:r>
-      <w:proofErr w:type="gramEnd"/>
-      <w:r>
-        <w:t>_permissions</w:t>
-      </w:r>
-      <w:proofErr w:type="spellEnd"/>
-      <w:r>
-        <w:t xml:space="preserve"> AS p</w:t>
-      </w:r>
-    </w:p>
-    <w:p>
-      <w:r>
-        <w:t xml:space="preserve">    ON p.id = </w:t>
-      </w:r>
-      <w:proofErr w:type="spellStart"/>
-      <w:proofErr w:type="gramStart"/>
-      <w:r>
-        <w:t>rp.permission</w:t>
-      </w:r>
-      <w:proofErr w:type="gramEnd"/>
-      <w:r>
-        <w:t>_id</w:t>
-      </w:r>
-      <w:proofErr w:type="spellEnd"/>
+        <w:t xml:space="preserve">    r.id AS role_id,</w:t>
+      </w:r>
+    </w:p>
+    <w:p>
+      <w:r>
+        <w:t xml:space="preserve">    r.code AS role_code,</w:t>
+      </w:r>
+    </w:p>
+    <w:p>
+      <w:r>
+        <w:t xml:space="preserve">    r.name AS role_name,</w:t>
+      </w:r>
+    </w:p>
+    <w:p>
+      <w:r>
+        <w:t xml:space="preserve">    p.code AS permission_code</w:t>
+      </w:r>
+    </w:p>
+    <w:p>
+      <w:r>
+        <w:t>FROM public.auth_role_permissions AS rp</w:t>
+      </w:r>
+    </w:p>
+    <w:p>
+      <w:r>
+        <w:t>JOIN public.auth_roles AS r</w:t>
+      </w:r>
+    </w:p>
+    <w:p>
+      <w:r>
+        <w:t xml:space="preserve">    ON r.id = rp.role_id</w:t>
+      </w:r>
+    </w:p>
+    <w:p>
+      <w:r>
+        <w:t>JOIN public.auth_permissions AS p</w:t>
+      </w:r>
+    </w:p>
+    <w:p>
+      <w:r>
+        <w:t xml:space="preserve">    ON p.id = rp.permission_id</w:t>
+      </w:r>
     </w:p>
     <w:p>
       <w:r>
         <w:lastRenderedPageBreak/>
-        <w:t xml:space="preserve">WHERE </w:t>
-      </w:r>
-      <w:proofErr w:type="spellStart"/>
-      <w:proofErr w:type="gramStart"/>
-      <w:r>
-        <w:t>p.code</w:t>
-      </w:r>
-      <w:proofErr w:type="spellEnd"/>
-      <w:proofErr w:type="gramEnd"/>
-      <w:r>
-        <w:t xml:space="preserve"> = '</w:t>
-      </w:r>
-      <w:proofErr w:type="spellStart"/>
-      <w:r>
-        <w:t>TT_Close</w:t>
-      </w:r>
-      <w:proofErr w:type="spellEnd"/>
-      <w:r>
-        <w:t>'</w:t>
+        <w:t>WHERE p.code = 'TT_Close'</w:t>
       </w:r>
     </w:p>
     <w:p>
@@ -1214,7 +662,7 @@
                     <pic:cNvPicPr/>
                   </pic:nvPicPr>
                   <pic:blipFill>
-                    <a:blip r:embed="rId6"/>
+                    <a:blip r:embed="rId7"/>
                     <a:stretch>
                       <a:fillRect/>
                     </a:stretch>
@@ -1260,7 +708,7 @@
                     <pic:cNvPicPr/>
                   </pic:nvPicPr>
                   <pic:blipFill>
-                    <a:blip r:embed="rId7"/>
+                    <a:blip r:embed="rId8"/>
                     <a:stretch>
                       <a:fillRect/>
                     </a:stretch>
@@ -1316,7 +764,7 @@
                     <pic:cNvPicPr/>
                   </pic:nvPicPr>
                   <pic:blipFill>
-                    <a:blip r:embed="rId8"/>
+                    <a:blip r:embed="rId9"/>
                     <a:stretch>
                       <a:fillRect/>
                     </a:stretch>
@@ -1356,7 +804,7 @@
     </w:p>
     <w:p/>
     <w:p>
-      <w:hyperlink r:id="rId9" w:history="1">
+      <w:hyperlink r:id="rId10" w:history="1">
         <w:r>
           <w:rPr>
             <w:rStyle w:val="Hyperlink"/>
@@ -1377,41 +825,17 @@
     </w:p>
     <w:p>
       <w:r>
-        <w:t xml:space="preserve">Export columns </w:t>
-      </w:r>
-      <w:proofErr w:type="gramStart"/>
-      <w:r>
-        <w:t>doesn't</w:t>
-      </w:r>
-      <w:proofErr w:type="gramEnd"/>
-      <w:r>
-        <w:t xml:space="preserve"> exist in target module</w:t>
-      </w:r>
-    </w:p>
-    <w:p>
-      <w:r>
-        <w:t>./app/dashboard/trouble-tickets/</w:t>
-      </w:r>
-      <w:proofErr w:type="spellStart"/>
-      <w:r>
-        <w:t>page.tsx</w:t>
-      </w:r>
-      <w:proofErr w:type="spellEnd"/>
-      <w:r>
-        <w:t xml:space="preserve"> (29:1)</w:t>
-      </w:r>
-    </w:p>
-    <w:p>
-      <w:r>
-        <w:t xml:space="preserve">Export columns </w:t>
-      </w:r>
-      <w:proofErr w:type="gramStart"/>
-      <w:r>
-        <w:t>doesn't</w:t>
-      </w:r>
-      <w:proofErr w:type="gramEnd"/>
-      <w:r>
-        <w:t xml:space="preserve"> exist in target module</w:t>
+        <w:t>Export columns doesn't exist in target module</w:t>
+      </w:r>
+    </w:p>
+    <w:p>
+      <w:r>
+        <w:t>./app/dashboard/trouble-tickets/page.tsx (29:1)</w:t>
+      </w:r>
+    </w:p>
+    <w:p>
+      <w:r>
+        <w:t>Export columns doesn't exist in target module</w:t>
       </w:r>
     </w:p>
     <w:p>
@@ -1447,15 +871,7 @@
     </w:p>
     <w:p>
       <w:r>
-        <w:t xml:space="preserve">&gt; 31 |     </w:t>
-      </w:r>
-      <w:proofErr w:type="spellStart"/>
-      <w:r>
-        <w:t>toSection</w:t>
-      </w:r>
-      <w:proofErr w:type="spellEnd"/>
-      <w:r>
-        <w:t>,</w:t>
+        <w:t>&gt; 31 |     toSection,</w:t>
       </w:r>
     </w:p>
     <w:p>
@@ -1465,23 +881,7 @@
     </w:p>
     <w:p>
       <w:r>
-        <w:t xml:space="preserve">&gt; 32 </w:t>
-      </w:r>
-      <w:proofErr w:type="gramStart"/>
-      <w:r>
-        <w:t>| }</w:t>
-      </w:r>
-      <w:proofErr w:type="gramEnd"/>
-      <w:r>
-        <w:t xml:space="preserve"> from "@/components/</w:t>
-      </w:r>
-      <w:proofErr w:type="spellStart"/>
-      <w:r>
-        <w:t>tt</w:t>
-      </w:r>
-      <w:proofErr w:type="spellEnd"/>
-      <w:r>
-        <w:t>-columns";</w:t>
+        <w:t>&gt; 32 | } from "@/components/tt-columns";</w:t>
       </w:r>
     </w:p>
     <w:p>
@@ -1507,64 +907,17 @@
     <w:p/>
     <w:p>
       <w:r>
-        <w:t xml:space="preserve">The export columns </w:t>
-      </w:r>
-      <w:proofErr w:type="gramStart"/>
-      <w:r>
-        <w:t>was</w:t>
-      </w:r>
-      <w:proofErr w:type="gramEnd"/>
-      <w:r>
-        <w:t xml:space="preserve"> not found in module [project]/components/</w:t>
-      </w:r>
-      <w:proofErr w:type="spellStart"/>
-      <w:r>
-        <w:t>tt-columns.tsx</w:t>
-      </w:r>
-      <w:proofErr w:type="spellEnd"/>
-      <w:r>
-        <w:t xml:space="preserve"> [app-client] (</w:t>
-      </w:r>
-      <w:proofErr w:type="spellStart"/>
-      <w:r>
-        <w:t>ecmascript</w:t>
-      </w:r>
-      <w:proofErr w:type="spellEnd"/>
-      <w:r>
-        <w:t>).</w:t>
-      </w:r>
-    </w:p>
-    <w:p>
-      <w:proofErr w:type="gramStart"/>
-      <w:r>
-        <w:t>Did</w:t>
-      </w:r>
-      <w:proofErr w:type="gramEnd"/>
-      <w:r>
-        <w:t xml:space="preserve"> you mean to import </w:t>
-      </w:r>
-      <w:proofErr w:type="spellStart"/>
-      <w:proofErr w:type="gramStart"/>
-      <w:r>
-        <w:t>toSection</w:t>
-      </w:r>
-      <w:proofErr w:type="spellEnd"/>
-      <w:proofErr w:type="gramEnd"/>
-      <w:r>
-        <w:t>?</w:t>
-      </w:r>
-    </w:p>
-    <w:p>
-      <w:r>
-        <w:t xml:space="preserve">All exports of the module are statically known (It doesn't have dynamic exports). </w:t>
-      </w:r>
-      <w:proofErr w:type="gramStart"/>
-      <w:r>
-        <w:t>So</w:t>
-      </w:r>
-      <w:proofErr w:type="gramEnd"/>
-      <w:r>
-        <w:t xml:space="preserve"> it's known statically that the requested export doesn't exist.</w:t>
+        <w:t>The export columns was not found in module [project]/components/tt-columns.tsx [app-client] (ecmascript).</w:t>
+      </w:r>
+    </w:p>
+    <w:p>
+      <w:r>
+        <w:t>Did you mean to import toSection?</w:t>
+      </w:r>
+    </w:p>
+    <w:p>
+      <w:r>
+        <w:t>All exports of the module are statically known (It doesn't have dynamic exports). So it's known statically that the requested export doesn't exist.</w:t>
       </w:r>
     </w:p>
     <w:p/>
@@ -1580,28 +933,12 @@
     </w:p>
     <w:p>
       <w:r>
-        <w:t xml:space="preserve">    ./app/dashboard/trouble-tickets/</w:t>
-      </w:r>
-      <w:proofErr w:type="spellStart"/>
-      <w:r>
-        <w:t>page.tsx</w:t>
-      </w:r>
-      <w:proofErr w:type="spellEnd"/>
-      <w:r>
-        <w:t xml:space="preserve"> [Client Component Browser]</w:t>
-      </w:r>
-    </w:p>
-    <w:p>
-      <w:r>
-        <w:t xml:space="preserve">    ./app/dashboard/trouble-tickets/</w:t>
-      </w:r>
-      <w:proofErr w:type="spellStart"/>
-      <w:r>
-        <w:t>page.tsx</w:t>
-      </w:r>
-      <w:proofErr w:type="spellEnd"/>
-      <w:r>
-        <w:t xml:space="preserve"> [Server Component]</w:t>
+        <w:t xml:space="preserve">    ./app/dashboard/trouble-tickets/page.tsx [Client Component Browser]</w:t>
+      </w:r>
+    </w:p>
+    <w:p>
+      <w:r>
+        <w:t xml:space="preserve">    ./app/dashboard/trouble-tickets/page.tsx [Server Component]</w:t>
       </w:r>
     </w:p>
     <w:p/>
@@ -1612,28 +949,12 @@
     </w:p>
     <w:p>
       <w:r>
-        <w:t xml:space="preserve">    ./app/dashboard/trouble-tickets/</w:t>
-      </w:r>
-      <w:proofErr w:type="spellStart"/>
-      <w:r>
-        <w:t>page.tsx</w:t>
-      </w:r>
-      <w:proofErr w:type="spellEnd"/>
-      <w:r>
-        <w:t xml:space="preserve"> [Client Component SSR]</w:t>
-      </w:r>
-    </w:p>
-    <w:p>
-      <w:r>
-        <w:t xml:space="preserve">    ./app/dashboard/trouble-tickets/</w:t>
-      </w:r>
-      <w:proofErr w:type="spellStart"/>
-      <w:r>
-        <w:t>page.tsx</w:t>
-      </w:r>
-      <w:proofErr w:type="spellEnd"/>
-      <w:r>
-        <w:t xml:space="preserve"> [Server Component]</w:t>
+        <w:t xml:space="preserve">    ./app/dashboard/trouble-tickets/page.tsx [Client Component SSR]</w:t>
+      </w:r>
+    </w:p>
+    <w:p>
+      <w:r>
+        <w:t xml:space="preserve">    ./app/dashboard/trouble-tickets/page.tsx [Server Component]</w:t>
       </w:r>
     </w:p>
     <w:p/>
@@ -1667,7 +988,7 @@
                     <pic:cNvPicPr/>
                   </pic:nvPicPr>
                   <pic:blipFill>
-                    <a:blip r:embed="rId10"/>
+                    <a:blip r:embed="rId11"/>
                     <a:stretch>
                       <a:fillRect/>
                     </a:stretch>
@@ -1719,7 +1040,7 @@
                     <pic:cNvPicPr/>
                   </pic:nvPicPr>
                   <pic:blipFill>
-                    <a:blip r:embed="rId11"/>
+                    <a:blip r:embed="rId12"/>
                     <a:stretch>
                       <a:fillRect/>
                     </a:stretch>
@@ -1743,15 +1064,7 @@
     <w:p/>
     <w:p>
       <w:r>
-        <w:t xml:space="preserve">After assigned it will be delivered to </w:t>
-      </w:r>
-      <w:proofErr w:type="gramStart"/>
-      <w:r>
-        <w:t>employees</w:t>
-      </w:r>
-      <w:proofErr w:type="gramEnd"/>
-      <w:r>
-        <w:t xml:space="preserve"> and the</w:t>
+        <w:t>After assigned it will be delivered to employees and the</w:t>
       </w:r>
       <w:r>
         <w:t xml:space="preserve"> below form is device assigned</w:t>
@@ -1788,7 +1101,7 @@
                     <pic:cNvPicPr/>
                   </pic:nvPicPr>
                   <pic:blipFill>
-                    <a:blip r:embed="rId12"/>
+                    <a:blip r:embed="rId13"/>
                     <a:stretch>
                       <a:fillRect/>
                     </a:stretch>
@@ -1813,6 +1126,9 @@
     <w:p/>
     <w:p>
       <w:r>
+        <w:rPr>
+          <w:noProof/>
+        </w:rPr>
         <w:drawing>
           <wp:inline distT="0" distB="0" distL="0" distR="0" wp14:anchorId="62CF84F9" wp14:editId="4F8FA6F8">
             <wp:extent cx="5943600" cy="3184525"/>
@@ -1829,7 +1145,7 @@
                     <pic:cNvPicPr/>
                   </pic:nvPicPr>
                   <pic:blipFill>
-                    <a:blip r:embed="rId13"/>
+                    <a:blip r:embed="rId14"/>
                     <a:stretch>
                       <a:fillRect/>
                     </a:stretch>
@@ -1855,52 +1171,15 @@
     <w:p/>
     <w:p>
       <w:r>
-        <w:t xml:space="preserve">need to set Create button inside Urgent Tasks and if </w:t>
-      </w:r>
-      <w:proofErr w:type="spellStart"/>
-      <w:r>
-        <w:t>ugent</w:t>
-      </w:r>
-      <w:proofErr w:type="spellEnd"/>
-      <w:r>
-        <w:t xml:space="preserve"> task more than 3It will be show 3+ and same will be department and TT Creators Today from IT and Only showing IT Personnel List if more than </w:t>
-      </w:r>
-      <w:proofErr w:type="gramStart"/>
-      <w:r>
-        <w:t>3 .</w:t>
-      </w:r>
-      <w:proofErr w:type="gramEnd"/>
-      <w:r>
-        <w:t xml:space="preserve"> </w:t>
-      </w:r>
-      <w:proofErr w:type="gramStart"/>
-      <w:r>
-        <w:t>it</w:t>
-      </w:r>
-      <w:proofErr w:type="gramEnd"/>
-      <w:r>
-        <w:t xml:space="preserve"> </w:t>
-      </w:r>
-      <w:proofErr w:type="spellStart"/>
-      <w:r>
-        <w:t>wil</w:t>
-      </w:r>
-      <w:proofErr w:type="spellEnd"/>
-      <w:r>
-        <w:t xml:space="preserve"> </w:t>
-      </w:r>
-      <w:proofErr w:type="spellStart"/>
-      <w:r>
-        <w:t>lbe</w:t>
-      </w:r>
-      <w:proofErr w:type="spellEnd"/>
-      <w:r>
-        <w:t xml:space="preserve"> show 3 + and others department will be not showed and after assigning, assigning person will get a notification.</w:t>
-      </w:r>
-    </w:p>
-    <w:p/>
-    <w:p>
-      <w:r>
+        <w:t>need to set Create button inside Urgent Tasks and if ugent task more than 3It will be show 3+ and same will be department and TT Creators Today from IT and Only showing IT Personnel List if more than 3 . it wil lbe show 3 + and others department will be not showed and after assigning, assigning person will get a notification.</w:t>
+      </w:r>
+    </w:p>
+    <w:p/>
+    <w:p>
+      <w:r>
+        <w:rPr>
+          <w:noProof/>
+        </w:rPr>
         <w:drawing>
           <wp:inline distT="0" distB="0" distL="0" distR="0" wp14:anchorId="0F2AD9C6" wp14:editId="79F143B0">
             <wp:extent cx="2171888" cy="1234547"/>
@@ -1917,7 +1196,7 @@
                     <pic:cNvPicPr/>
                   </pic:nvPicPr>
                   <pic:blipFill>
-                    <a:blip r:embed="rId14"/>
+                    <a:blip r:embed="rId15"/>
                     <a:stretch>
                       <a:fillRect/>
                     </a:stretch>
@@ -1943,7 +1222,132 @@
     <w:p/>
     <w:p/>
     <w:p/>
-    <w:p/>
+    <w:p>
+      <w:r>
+        <w:rPr>
+          <w:noProof/>
+        </w:rPr>
+        <w:drawing>
+          <wp:inline distT="0" distB="0" distL="0" distR="0" wp14:anchorId="4D2664DD" wp14:editId="67D8D2B4">
+            <wp:extent cx="5943600" cy="3034030"/>
+            <wp:effectExtent l="0" t="0" r="0" b="0"/>
+            <wp:docPr id="1263626117" name="Picture 1"/>
+            <wp:cNvGraphicFramePr>
+              <a:graphicFrameLocks xmlns:a="http://schemas.openxmlformats.org/drawingml/2006/main" noChangeAspect="1"/>
+            </wp:cNvGraphicFramePr>
+            <a:graphic xmlns:a="http://schemas.openxmlformats.org/drawingml/2006/main">
+              <a:graphicData uri="http://schemas.openxmlformats.org/drawingml/2006/picture">
+                <pic:pic xmlns:pic="http://schemas.openxmlformats.org/drawingml/2006/picture">
+                  <pic:nvPicPr>
+                    <pic:cNvPr id="1263626117" name=""/>
+                    <pic:cNvPicPr/>
+                  </pic:nvPicPr>
+                  <pic:blipFill>
+                    <a:blip r:embed="rId16"/>
+                    <a:stretch>
+                      <a:fillRect/>
+                    </a:stretch>
+                  </pic:blipFill>
+                  <pic:spPr>
+                    <a:xfrm>
+                      <a:off x="0" y="0"/>
+                      <a:ext cx="5943600" cy="3034030"/>
+                    </a:xfrm>
+                    <a:prstGeom prst="rect">
+                      <a:avLst/>
+                    </a:prstGeom>
+                  </pic:spPr>
+                </pic:pic>
+              </a:graphicData>
+            </a:graphic>
+          </wp:inline>
+        </w:drawing>
+      </w:r>
+    </w:p>
+    <w:p/>
+    <w:p/>
+    <w:p>
+      <w:r>
+        <w:drawing>
+          <wp:inline distT="0" distB="0" distL="0" distR="0" wp14:anchorId="19231257" wp14:editId="1DEFFF57">
+            <wp:extent cx="5943600" cy="3069590"/>
+            <wp:effectExtent l="0" t="0" r="0" b="0"/>
+            <wp:docPr id="1945284746" name="Picture 1"/>
+            <wp:cNvGraphicFramePr>
+              <a:graphicFrameLocks xmlns:a="http://schemas.openxmlformats.org/drawingml/2006/main" noChangeAspect="1"/>
+            </wp:cNvGraphicFramePr>
+            <a:graphic xmlns:a="http://schemas.openxmlformats.org/drawingml/2006/main">
+              <a:graphicData uri="http://schemas.openxmlformats.org/drawingml/2006/picture">
+                <pic:pic xmlns:pic="http://schemas.openxmlformats.org/drawingml/2006/picture">
+                  <pic:nvPicPr>
+                    <pic:cNvPr id="1945284746" name=""/>
+                    <pic:cNvPicPr/>
+                  </pic:nvPicPr>
+                  <pic:blipFill>
+                    <a:blip r:embed="rId17"/>
+                    <a:stretch>
+                      <a:fillRect/>
+                    </a:stretch>
+                  </pic:blipFill>
+                  <pic:spPr>
+                    <a:xfrm>
+                      <a:off x="0" y="0"/>
+                      <a:ext cx="5943600" cy="3069590"/>
+                    </a:xfrm>
+                    <a:prstGeom prst="rect">
+                      <a:avLst/>
+                    </a:prstGeom>
+                  </pic:spPr>
+                </pic:pic>
+              </a:graphicData>
+            </a:graphic>
+          </wp:inline>
+        </w:drawing>
+      </w:r>
+    </w:p>
+    <w:p/>
+    <w:p/>
+    <w:p/>
+    <w:p/>
+    <w:p>
+      <w:r>
+        <w:drawing>
+          <wp:inline distT="0" distB="0" distL="0" distR="0" wp14:anchorId="541D1345" wp14:editId="7A791701">
+            <wp:extent cx="4343776" cy="1691787"/>
+            <wp:effectExtent l="0" t="0" r="0" b="3810"/>
+            <wp:docPr id="1680738027" name="Picture 1"/>
+            <wp:cNvGraphicFramePr>
+              <a:graphicFrameLocks xmlns:a="http://schemas.openxmlformats.org/drawingml/2006/main" noChangeAspect="1"/>
+            </wp:cNvGraphicFramePr>
+            <a:graphic xmlns:a="http://schemas.openxmlformats.org/drawingml/2006/main">
+              <a:graphicData uri="http://schemas.openxmlformats.org/drawingml/2006/picture">
+                <pic:pic xmlns:pic="http://schemas.openxmlformats.org/drawingml/2006/picture">
+                  <pic:nvPicPr>
+                    <pic:cNvPr id="1680738027" name=""/>
+                    <pic:cNvPicPr/>
+                  </pic:nvPicPr>
+                  <pic:blipFill>
+                    <a:blip r:embed="rId18"/>
+                    <a:stretch>
+                      <a:fillRect/>
+                    </a:stretch>
+                  </pic:blipFill>
+                  <pic:spPr>
+                    <a:xfrm>
+                      <a:off x="0" y="0"/>
+                      <a:ext cx="4343776" cy="1691787"/>
+                    </a:xfrm>
+                    <a:prstGeom prst="rect">
+                      <a:avLst/>
+                    </a:prstGeom>
+                  </pic:spPr>
+                </pic:pic>
+              </a:graphicData>
+            </a:graphic>
+          </wp:inline>
+        </w:drawing>
+      </w:r>
+    </w:p>
     <w:sectPr>
       <w:pgSz w:w="12240" w:h="15840"/>
       <w:pgMar w:top="1440" w:right="1440" w:bottom="1440" w:left="1440" w:header="720" w:footer="720" w:gutter="0"/>
@@ -2557,6 +1961,7 @@
   <w:style w:type="character" w:default="1" w:styleId="DefaultParagraphFont">
     <w:name w:val="Default Paragraph Font"/>
     <w:uiPriority w:val="1"/>
+    <w:semiHidden/>
     <w:unhideWhenUsed/>
   </w:style>
   <w:style w:type="table" w:default="1" w:styleId="TableNormal">

</xml_diff>